<commit_message>
Expand document content and update application count
Update application count from 500+ to 1,000 and enhance document sections with more detailed content and spacing.

Replit-Commit-Author: Agent
Replit-Commit-Session-Id: 85ca0e57-022c-4e07-8505-5330d2441dfb
Replit-Commit-Checkpoint-Type: full_checkpoint
Replit-Commit-Event-Id: 8b517918-9cea-4147-b404-f9a2324cef40
Replit-Commit-Screenshot-Url: https://storage.googleapis.com/screenshot-production-us-central1/c5ecfbc0-55f8-4296-b6fe-cd54067a2b61/85ca0e57-022c-4e07-8505-5330d2441dfb/tGntwW9
Replit-Helium-Checkpoint-Created: true
</commit_message>
<xml_diff>
--- a/attached_assets/IBM_Horizon_AMS_Executive_Summary_April2026.docx
+++ b/attached_assets/IBM_Horizon_AMS_Executive_Summary_April2026.docx
@@ -1837,7 +1837,7 @@
           <w:sz w:val="21"/>
           <w:szCs w:val="21"/>
         </w:rPr>
-        <w:t xml:space="preserve">Horizon BCBS manages approximately 500+ applications spanning enrollment, claims adjudication, member services, and data platforms. The incumbent delivery model — reactive, labor-intensive, and fragmented across towers — is no longer sufficient to meet Horizon’s growth objectives, competitive imperatives, or the expectations of its 3.7 million members.</w:t>
+        <w:t xml:space="preserve">Horizon BCBS manages approximately 1,000 applications spanning enrollment, claims adjudication, member services, provider operations, and data platforms. The organization faces mounting pressure to modernize operations, reduce administrative burden, and deliver measurably better member and provider experiences — while managing the complexity of an enterprise-scale portfolio that touches every aspect of the payer value chain.</w:t>
       </w:r>
     </w:p>
     <w:p>
@@ -1855,7 +1855,7 @@
           <w:sz w:val="21"/>
           <w:szCs w:val="21"/>
         </w:rPr>
-        <w:t xml:space="preserve">Horizon is not looking for a faster version of today. Horizon is looking for a fundamentally different operating model — one where AI is the engine, quality is continuous, delivery is zero-touch, and every operational metric connects to a member, a provider, or a patient.</w:t>
+        <w:t xml:space="preserve">The incumbent delivery model — reactive, labor-intensive, and fragmented across towers — is no longer sufficient to meet Horizon’s growth objectives, competitive imperatives, or the expectations of its 3.7 million members. Horizon is not looking for a faster version of today. Horizon is looking for a fundamentally different operating model — one where AI is the engine, quality is continuous, delivery is zero-touch, and every operational metric connects to a member, a provider, or a patient.</w:t>
       </w:r>
     </w:p>
     <w:p>
@@ -1892,6 +1892,24 @@
           <w:szCs w:val="21"/>
         </w:rPr>
         <w:t xml:space="preserve">IBM proposes a structured transition from reactive application support to a predictive, self-healing, continuously improving AI-first operating model — delivered through IBM’s proven Assets, Assistants, and Accelerators framework, and governed through an outcome-based accountability model that ties IBM’s performance directly to Horizon’s business results.</w:t>
+      </w:r>
+    </w:p>
+    <w:p>
+      <w:pPr>
+        <w:spacing w:after="100" w:before="0"/>
+      </w:pPr>
+      <w:r>
+        <w:rPr>
+          <w:rFonts w:ascii="Calibri" w:cs="Calibri" w:eastAsia="Calibri" w:hAnsi="Calibri"/>
+          <w:b w:val="false"/>
+          <w:bCs w:val="false"/>
+          <w:i w:val="false"/>
+          <w:iCs w:val="false"/>
+          <w:color w:val="525252"/>
+          <w:sz w:val="21"/>
+          <w:szCs w:val="21"/>
+        </w:rPr>
+        <w:t xml:space="preserve">This is not a staffing proposal. IBM is proposing a transformation partnership that embeds AI-driven intelligence into the operating model of Horizon BCBS — enabling a future-ready enterprise that is faster, smarter, and more resilient than today. IBM’s delivery model is built to compound value over time: every sprint, every resolved incident, and every automated test strengthens the foundation for what comes next.</w:t>
       </w:r>
     </w:p>
     <w:p>
@@ -1932,7 +1950,7 @@
           <w:sz w:val="21"/>
           <w:szCs w:val="21"/>
         </w:rPr>
-        <w:t xml:space="preserve">AI-First Operating Model — AI embedded across every layer of development, quality, and operations. Not bolted on. Built in.</w:t>
+        <w:t xml:space="preserve">AI-First Operating Model — AI embedded across every layer of development, quality, and operations. Not bolted on. Built in. Every engineer, every tester, every operator works with AI as a partner.</w:t>
       </w:r>
     </w:p>
     <w:p>
@@ -1955,7 +1973,7 @@
           <w:sz w:val="21"/>
           <w:szCs w:val="21"/>
         </w:rPr>
-        <w:t xml:space="preserve">Tech Arbitrage over Labor Arbitrage — Compressing cost through automation and intelligence, not headcount.</w:t>
+        <w:t xml:space="preserve">Tech Arbitrage over Labor Arbitrage — Compressing cost through automation and intelligence, not headcount. The savings are structural and permanent.</w:t>
       </w:r>
     </w:p>
     <w:p>
@@ -1978,7 +1996,7 @@
           <w:sz w:val="21"/>
           <w:szCs w:val="21"/>
         </w:rPr>
-        <w:t xml:space="preserve">Outcome-Based Delivery — Committed SLAs tied to measurable business outcomes. IBM’s success is Horizon’s success.</w:t>
+        <w:t xml:space="preserve">Outcome-Based Delivery — Committed SLAs tied to measurable business outcomes. IBM’s success is Horizon’s success. Targets missed trigger IBM remediation — not rate renegotiations.</w:t>
       </w:r>
     </w:p>
     <w:p>
@@ -2001,7 +2019,7 @@
           <w:sz w:val="21"/>
           <w:szCs w:val="21"/>
         </w:rPr>
-        <w:t xml:space="preserve">Zero-Disruption Transition — Risk-free phased delivery protecting operational continuity from Day 1.</w:t>
+        <w:t xml:space="preserve">Zero-Disruption Transition — Risk-free phased delivery protecting operational continuity from Day 1. No production disruption. No member impact. No learning curve at Horizon’s expense.</w:t>
       </w:r>
     </w:p>
     <w:p>
@@ -2024,7 +2042,20 @@
           <w:sz w:val="21"/>
           <w:szCs w:val="21"/>
         </w:rPr>
-        <w:t xml:space="preserve">Agentic by Core — AI agents that detect, triage, diagnose, resolve, and learn — compounding intelligence with every incident.</w:t>
+        <w:t xml:space="preserve">Agentic by Core — AI agents that detect, triage, diagnose, resolve, and learn — compounding intelligence with every incident. The system gets smarter every day without manual intervention.</w:t>
+      </w:r>
+    </w:p>
+    <w:p>
+      <w:pPr>
+        <w:spacing w:after="120" w:before="0"/>
+      </w:pPr>
+      <w:r>
+        <w:rPr>
+          <w:rFonts w:ascii="Calibri" w:cs="Calibri" w:eastAsia="Calibri" w:hAnsi="Calibri"/>
+          <w:sz w:val="12"/>
+          <w:szCs w:val="12"/>
+        </w:rPr>
+        <w:t xml:space="preserve"/>
       </w:r>
     </w:p>
     <w:p>
@@ -2157,12 +2188,81 @@
           <w:sz w:val="21"/>
           <w:szCs w:val="21"/>
         </w:rPr>
+        <w:t xml:space="preserve">9 of the top 10 US health payers served by IBM Consulting.</w:t>
+      </w:r>
+    </w:p>
+    <w:p>
+      <w:pPr>
+        <w:pStyle w:val="ListParagraph"/>
+        <w:numPr>
+          <w:ilvl w:val="0"/>
+          <w:numId w:val="1"/>
+        </w:numPr>
+        <w:spacing w:after="60" w:before="20"/>
+      </w:pPr>
+      <w:r>
+        <w:rPr>
+          <w:rFonts w:ascii="Calibri" w:cs="Calibri" w:eastAsia="Calibri" w:hAnsi="Calibri"/>
+          <w:b w:val="false"/>
+          <w:bCs w:val="false"/>
+          <w:i w:val="false"/>
+          <w:iCs w:val="false"/>
+          <w:color w:val="525252"/>
+          <w:sz w:val="21"/>
+          <w:szCs w:val="21"/>
+        </w:rPr>
+        <w:t xml:space="preserve">Leader in Enterprise Software Quality &amp; Testing.</w:t>
+      </w:r>
+    </w:p>
+    <w:p>
+      <w:pPr>
+        <w:pStyle w:val="ListParagraph"/>
+        <w:numPr>
+          <w:ilvl w:val="0"/>
+          <w:numId w:val="1"/>
+        </w:numPr>
+        <w:spacing w:after="60" w:before="20"/>
+      </w:pPr>
+      <w:r>
+        <w:rPr>
+          <w:rFonts w:ascii="Calibri" w:cs="Calibri" w:eastAsia="Calibri" w:hAnsi="Calibri"/>
+          <w:b w:val="false"/>
+          <w:bCs w:val="false"/>
+          <w:i w:val="false"/>
+          <w:iCs w:val="false"/>
+          <w:color w:val="525252"/>
+          <w:sz w:val="21"/>
+          <w:szCs w:val="21"/>
+        </w:rPr>
+        <w:t xml:space="preserve">Enterprise partnerships with AWS, Salesforce, and IBM Technology.</w:t>
+      </w:r>
+    </w:p>
+    <w:p>
+      <w:pPr>
+        <w:pStyle w:val="ListParagraph"/>
+        <w:numPr>
+          <w:ilvl w:val="0"/>
+          <w:numId w:val="1"/>
+        </w:numPr>
+        <w:spacing w:after="60" w:before="20"/>
+      </w:pPr>
+      <w:r>
+        <w:rPr>
+          <w:rFonts w:ascii="Calibri" w:cs="Calibri" w:eastAsia="Calibri" w:hAnsi="Calibri"/>
+          <w:b w:val="false"/>
+          <w:bCs w:val="false"/>
+          <w:i w:val="false"/>
+          <w:iCs w:val="false"/>
+          <w:color w:val="525252"/>
+          <w:sz w:val="21"/>
+          <w:szCs w:val="21"/>
+        </w:rPr>
         <w:t xml:space="preserve">IBM’s Client-0 AI programme saved IBM approximately $3.4B USD — the same model applied here.</w:t>
       </w:r>
     </w:p>
     <w:p>
       <w:pPr>
-        <w:spacing w:after="160" w:before="0"/>
+        <w:spacing w:after="200" w:before="0"/>
       </w:pPr>
       <w:r>
         <w:rPr>
@@ -2227,7 +2327,7 @@
                 <w:sz w:val="56"/>
                 <w:szCs w:val="56"/>
               </w:rPr>
-              <w:t xml:space="preserve">500+</w:t>
+              <w:t xml:space="preserve">~1,000</w:t>
             </w:r>
           </w:p>
           <w:p>
@@ -2483,386 +2583,6 @@
     </w:p>
     <w:p>
       <w:pPr>
-        <w:spacing w:after="80" w:before="200"/>
-      </w:pPr>
-      <w:r>
-        <w:rPr>
-          <w:rFonts w:ascii="Calibri" w:cs="Calibri" w:eastAsia="Calibri" w:hAnsi="Calibri"/>
-          <w:b/>
-          <w:bCs/>
-          <w:i w:val="false"/>
-          <w:iCs w:val="false"/>
-          <w:color w:val="001141"/>
-          <w:sz w:val="24"/>
-          <w:szCs w:val="24"/>
-        </w:rPr>
-        <w:t xml:space="preserve">What Horizon Needs</w:t>
-      </w:r>
-    </w:p>
-    <w:p>
-      <w:pPr>
-        <w:spacing w:after="100" w:before="0"/>
-      </w:pPr>
-      <w:r>
-        <w:rPr>
-          <w:rFonts w:ascii="Calibri" w:cs="Calibri" w:eastAsia="Calibri" w:hAnsi="Calibri"/>
-          <w:b w:val="false"/>
-          <w:bCs w:val="false"/>
-          <w:i w:val="false"/>
-          <w:iCs w:val="false"/>
-          <w:color w:val="525252"/>
-          <w:sz w:val="21"/>
-          <w:szCs w:val="21"/>
-        </w:rPr>
-        <w:t xml:space="preserve">Horizon BCBS is seeking the right strategic partner to enhance and support its Application Development, Maintenance, Data, and Testing Services — with a clear focus on AI solutions and expertise native to the Horizon environment.</w:t>
-      </w:r>
-    </w:p>
-    <w:p>
-      <w:pPr>
-        <w:spacing w:after="80" w:before="200"/>
-      </w:pPr>
-      <w:r>
-        <w:rPr>
-          <w:rFonts w:ascii="Calibri" w:cs="Calibri" w:eastAsia="Calibri" w:hAnsi="Calibri"/>
-          <w:b/>
-          <w:bCs/>
-          <w:i w:val="false"/>
-          <w:iCs w:val="false"/>
-          <w:color w:val="001141"/>
-          <w:sz w:val="24"/>
-          <w:szCs w:val="24"/>
-        </w:rPr>
-        <w:t xml:space="preserve">Service Transformation Goals</w:t>
-      </w:r>
-    </w:p>
-    <w:p>
-      <w:pPr>
-        <w:pStyle w:val="ListParagraph"/>
-        <w:numPr>
-          <w:ilvl w:val="0"/>
-          <w:numId w:val="1"/>
-        </w:numPr>
-        <w:spacing w:after="60" w:before="20"/>
-      </w:pPr>
-      <w:r>
-        <w:rPr>
-          <w:rFonts w:ascii="Calibri" w:cs="Calibri" w:eastAsia="Calibri" w:hAnsi="Calibri"/>
-          <w:b w:val="false"/>
-          <w:bCs w:val="false"/>
-          <w:i w:val="false"/>
-          <w:iCs w:val="false"/>
-          <w:color w:val="525252"/>
-          <w:sz w:val="21"/>
-          <w:szCs w:val="21"/>
-        </w:rPr>
-        <w:t xml:space="preserve">High-quality services delivered through AI and automation to achieve operational efficiencies.</w:t>
-      </w:r>
-    </w:p>
-    <w:p>
-      <w:pPr>
-        <w:pStyle w:val="ListParagraph"/>
-        <w:numPr>
-          <w:ilvl w:val="0"/>
-          <w:numId w:val="1"/>
-        </w:numPr>
-        <w:spacing w:after="60" w:before="20"/>
-      </w:pPr>
-      <w:r>
-        <w:rPr>
-          <w:rFonts w:ascii="Calibri" w:cs="Calibri" w:eastAsia="Calibri" w:hAnsi="Calibri"/>
-          <w:b w:val="false"/>
-          <w:bCs w:val="false"/>
-          <w:i w:val="false"/>
-          <w:iCs w:val="false"/>
-          <w:color w:val="525252"/>
-          <w:sz w:val="21"/>
-          <w:szCs w:val="21"/>
-        </w:rPr>
-        <w:t xml:space="preserve">Realization of a product-oriented operating model aligned to business domains.</w:t>
-      </w:r>
-    </w:p>
-    <w:p>
-      <w:pPr>
-        <w:pStyle w:val="ListParagraph"/>
-        <w:numPr>
-          <w:ilvl w:val="0"/>
-          <w:numId w:val="1"/>
-        </w:numPr>
-        <w:spacing w:after="60" w:before="20"/>
-      </w:pPr>
-      <w:r>
-        <w:rPr>
-          <w:rFonts w:ascii="Calibri" w:cs="Calibri" w:eastAsia="Calibri" w:hAnsi="Calibri"/>
-          <w:b w:val="false"/>
-          <w:bCs w:val="false"/>
-          <w:i w:val="false"/>
-          <w:iCs w:val="false"/>
-          <w:color w:val="525252"/>
-          <w:sz w:val="21"/>
-          <w:szCs w:val="21"/>
-        </w:rPr>
-        <w:t xml:space="preserve">Focused automation — especially in testing and quality engineering — to measurably reduce cost.</w:t>
-      </w:r>
-    </w:p>
-    <w:p>
-      <w:pPr>
-        <w:pStyle w:val="ListParagraph"/>
-        <w:numPr>
-          <w:ilvl w:val="0"/>
-          <w:numId w:val="1"/>
-        </w:numPr>
-        <w:spacing w:after="60" w:before="20"/>
-      </w:pPr>
-      <w:r>
-        <w:rPr>
-          <w:rFonts w:ascii="Calibri" w:cs="Calibri" w:eastAsia="Calibri" w:hAnsi="Calibri"/>
-          <w:b w:val="false"/>
-          <w:bCs w:val="false"/>
-          <w:i w:val="false"/>
-          <w:iCs w:val="false"/>
-          <w:color w:val="525252"/>
-          <w:sz w:val="21"/>
-          <w:szCs w:val="21"/>
-        </w:rPr>
-        <w:t xml:space="preserve">AI tools to drive Agile application modernization across the portfolio.</w:t>
-      </w:r>
-    </w:p>
-    <w:p>
-      <w:pPr>
-        <w:pStyle w:val="ListParagraph"/>
-        <w:numPr>
-          <w:ilvl w:val="0"/>
-          <w:numId w:val="1"/>
-        </w:numPr>
-        <w:spacing w:after="60" w:before="20"/>
-      </w:pPr>
-      <w:r>
-        <w:rPr>
-          <w:rFonts w:ascii="Calibri" w:cs="Calibri" w:eastAsia="Calibri" w:hAnsi="Calibri"/>
-          <w:b w:val="false"/>
-          <w:bCs w:val="false"/>
-          <w:i w:val="false"/>
-          <w:iCs w:val="false"/>
-          <w:color w:val="525252"/>
-          <w:sz w:val="21"/>
-          <w:szCs w:val="21"/>
-        </w:rPr>
-        <w:t xml:space="preserve">Consultative support applying deep healthcare payer best practices.</w:t>
-      </w:r>
-    </w:p>
-    <w:p>
-      <w:pPr>
-        <w:spacing w:after="80" w:before="200"/>
-      </w:pPr>
-      <w:r>
-        <w:rPr>
-          <w:rFonts w:ascii="Calibri" w:cs="Calibri" w:eastAsia="Calibri" w:hAnsi="Calibri"/>
-          <w:b/>
-          <w:bCs/>
-          <w:i w:val="false"/>
-          <w:iCs w:val="false"/>
-          <w:color w:val="001141"/>
-          <w:sz w:val="24"/>
-          <w:szCs w:val="24"/>
-        </w:rPr>
-        <w:t xml:space="preserve">Cost Structure Expectations</w:t>
-      </w:r>
-    </w:p>
-    <w:p>
-      <w:pPr>
-        <w:spacing w:after="100" w:before="0"/>
-      </w:pPr>
-      <w:r>
-        <w:rPr>
-          <w:rFonts w:ascii="Calibri" w:cs="Calibri" w:eastAsia="Calibri" w:hAnsi="Calibri"/>
-          <w:b w:val="false"/>
-          <w:bCs w:val="false"/>
-          <w:i w:val="false"/>
-          <w:iCs w:val="false"/>
-          <w:color w:val="525252"/>
-          <w:sz w:val="21"/>
-          <w:szCs w:val="21"/>
-        </w:rPr>
-        <w:t xml:space="preserve">Horizon expects structural cost reduction — not just efficiency gains. The fixed baseline model signals a clear expectation: year-over-year productivity improvements and cost takeout driven by automation and AI, not rate arbitrage.</w:t>
-      </w:r>
-    </w:p>
-    <w:p>
-      <w:pPr>
-        <w:spacing w:after="80" w:before="200"/>
-      </w:pPr>
-      <w:r>
-        <w:rPr>
-          <w:rFonts w:ascii="Calibri" w:cs="Calibri" w:eastAsia="Calibri" w:hAnsi="Calibri"/>
-          <w:b/>
-          <w:bCs/>
-          <w:i w:val="false"/>
-          <w:iCs w:val="false"/>
-          <w:color w:val="001141"/>
-          <w:sz w:val="24"/>
-          <w:szCs w:val="24"/>
-        </w:rPr>
-        <w:t xml:space="preserve">Factors That Shaped IBM’s Solution</w:t>
-      </w:r>
-    </w:p>
-    <w:p>
-      <w:pPr>
-        <w:spacing w:after="40" w:before="120"/>
-      </w:pPr>
-      <w:r>
-        <w:rPr>
-          <w:rFonts w:ascii="Calibri" w:cs="Calibri" w:eastAsia="Calibri" w:hAnsi="Calibri"/>
-          <w:b/>
-          <w:bCs/>
-          <w:i w:val="false"/>
-          <w:iCs w:val="false"/>
-          <w:color w:val="0F62FE"/>
-          <w:sz w:val="21"/>
-          <w:szCs w:val="21"/>
-        </w:rPr>
-        <w:t xml:space="preserve">End-to-End Integrated Delivery</w:t>
-      </w:r>
-    </w:p>
-    <w:p>
-      <w:pPr>
-        <w:spacing w:after="100" w:before="0"/>
-      </w:pPr>
-      <w:r>
-        <w:rPr>
-          <w:rFonts w:ascii="Calibri" w:cs="Calibri" w:eastAsia="Calibri" w:hAnsi="Calibri"/>
-          <w:b w:val="false"/>
-          <w:bCs w:val="false"/>
-          <w:i w:val="false"/>
-          <w:iCs w:val="false"/>
-          <w:color w:val="525252"/>
-          <w:sz w:val="21"/>
-          <w:szCs w:val="21"/>
-        </w:rPr>
-        <w:t xml:space="preserve">A unified operating model across Application Maintenance, Development, Testing, and Data — reducing fragmentation and improving accountability across the full lifecycle.</w:t>
-      </w:r>
-    </w:p>
-    <w:p>
-      <w:pPr>
-        <w:spacing w:after="40" w:before="120"/>
-      </w:pPr>
-      <w:r>
-        <w:rPr>
-          <w:rFonts w:ascii="Calibri" w:cs="Calibri" w:eastAsia="Calibri" w:hAnsi="Calibri"/>
-          <w:b/>
-          <w:bCs/>
-          <w:i w:val="false"/>
-          <w:iCs w:val="false"/>
-          <w:color w:val="0F62FE"/>
-          <w:sz w:val="21"/>
-          <w:szCs w:val="21"/>
-        </w:rPr>
-        <w:t xml:space="preserve">AI at the Core — Not Bolted On</w:t>
-      </w:r>
-    </w:p>
-    <w:p>
-      <w:pPr>
-        <w:spacing w:after="100" w:before="0"/>
-      </w:pPr>
-      <w:r>
-        <w:rPr>
-          <w:rFonts w:ascii="Calibri" w:cs="Calibri" w:eastAsia="Calibri" w:hAnsi="Calibri"/>
-          <w:b w:val="false"/>
-          <w:bCs w:val="false"/>
-          <w:i w:val="false"/>
-          <w:iCs w:val="false"/>
-          <w:color w:val="525252"/>
-          <w:sz w:val="21"/>
-          <w:szCs w:val="21"/>
-        </w:rPr>
-        <w:t xml:space="preserve">AI is embedded in triage, root cause analysis, resolution, test automation, and continuous validation — from the first day of delivery.</w:t>
-      </w:r>
-    </w:p>
-    <w:p>
-      <w:pPr>
-        <w:spacing w:after="40" w:before="120"/>
-      </w:pPr>
-      <w:r>
-        <w:rPr>
-          <w:rFonts w:ascii="Calibri" w:cs="Calibri" w:eastAsia="Calibri" w:hAnsi="Calibri"/>
-          <w:b/>
-          <w:bCs/>
-          <w:i w:val="false"/>
-          <w:iCs w:val="false"/>
-          <w:color w:val="0F62FE"/>
-          <w:sz w:val="21"/>
-          <w:szCs w:val="21"/>
-        </w:rPr>
-        <w:t xml:space="preserve">Transition Without Disruption</w:t>
-      </w:r>
-    </w:p>
-    <w:p>
-      <w:pPr>
-        <w:spacing w:after="100" w:before="0"/>
-      </w:pPr>
-      <w:r>
-        <w:rPr>
-          <w:rFonts w:ascii="Calibri" w:cs="Calibri" w:eastAsia="Calibri" w:hAnsi="Calibri"/>
-          <w:b w:val="false"/>
-          <w:bCs w:val="false"/>
-          <w:i w:val="false"/>
-          <w:iCs w:val="false"/>
-          <w:color w:val="525252"/>
-          <w:sz w:val="21"/>
-          <w:szCs w:val="21"/>
-        </w:rPr>
-        <w:t xml:space="preserve">IBM’s phased transition approach maintains seamless service continuity while progressively modernizing the underlying operating model.</w:t>
-      </w:r>
-    </w:p>
-    <w:p>
-      <w:pPr>
-        <w:spacing w:after="40" w:before="120"/>
-      </w:pPr>
-      <w:r>
-        <w:rPr>
-          <w:rFonts w:ascii="Calibri" w:cs="Calibri" w:eastAsia="Calibri" w:hAnsi="Calibri"/>
-          <w:b/>
-          <w:bCs/>
-          <w:i w:val="false"/>
-          <w:iCs w:val="false"/>
-          <w:color w:val="0F62FE"/>
-          <w:sz w:val="21"/>
-          <w:szCs w:val="21"/>
-        </w:rPr>
-        <w:t xml:space="preserve">Open, Elastic Architecture</w:t>
-      </w:r>
-    </w:p>
-    <w:p>
-      <w:pPr>
-        <w:spacing w:after="100" w:before="0"/>
-      </w:pPr>
-      <w:r>
-        <w:rPr>
-          <w:rFonts w:ascii="Calibri" w:cs="Calibri" w:eastAsia="Calibri" w:hAnsi="Calibri"/>
-          <w:b w:val="false"/>
-          <w:bCs w:val="false"/>
-          <w:i w:val="false"/>
-          <w:iCs w:val="false"/>
-          <w:color w:val="525252"/>
-          <w:sz w:val="21"/>
-          <w:szCs w:val="21"/>
-        </w:rPr>
-        <w:t xml:space="preserve">Plug-and-play architecture deploys on Horizon’s existing AWS stack — avoiding lock-in and enabling flexibility across cloud ecosystems.</w:t>
-      </w:r>
-    </w:p>
-    <w:p>
-      <w:pPr>
-        <w:spacing w:after="80" w:before="0"/>
-      </w:pPr>
-      <w:r>
-        <w:rPr>
-          <w:rFonts w:ascii="Calibri" w:cs="Calibri" w:eastAsia="Calibri" w:hAnsi="Calibri"/>
-          <w:sz w:val="12"/>
-          <w:szCs w:val="12"/>
-        </w:rPr>
-        <w:t xml:space="preserve"/>
-      </w:r>
-    </w:p>
-    <w:p>
-      <w:pPr>
         <w:spacing w:after="80" w:before="0"/>
       </w:pPr>
       <w:r>
@@ -2893,6 +2613,440 @@
           <w:sz w:val="23"/>
           <w:szCs w:val="23"/>
         </w:rPr>
+        <w:t xml:space="preserve">“The question is not whether Horizon can afford to transform. The question is whether Horizon can afford not to — when every delayed claim is a member who loses trust, and every manual process is a cost that compounds.”</w:t>
+      </w:r>
+    </w:p>
+    <w:p>
+      <w:pPr>
+        <w:spacing w:after="120" w:before="0"/>
+        <w:jc w:val="right"/>
+      </w:pPr>
+      <w:r>
+        <w:rPr>
+          <w:rFonts w:ascii="Calibri" w:cs="Calibri" w:eastAsia="Calibri" w:hAnsi="Calibri"/>
+          <w:b/>
+          <w:bCs/>
+          <w:i w:val="false"/>
+          <w:iCs w:val="false"/>
+          <w:color w:val="0F62FE"/>
+          <w:sz w:val="18"/>
+          <w:szCs w:val="18"/>
+        </w:rPr>
+        <w:t xml:space="preserve">— IBM Consulting — Payer Strategy</w:t>
+      </w:r>
+    </w:p>
+    <w:p>
+      <w:pPr>
+        <w:spacing w:after="80" w:before="200"/>
+      </w:pPr>
+      <w:r>
+        <w:rPr>
+          <w:rFonts w:ascii="Calibri" w:cs="Calibri" w:eastAsia="Calibri" w:hAnsi="Calibri"/>
+          <w:b/>
+          <w:bCs/>
+          <w:i w:val="false"/>
+          <w:iCs w:val="false"/>
+          <w:color w:val="001141"/>
+          <w:sz w:val="24"/>
+          <w:szCs w:val="24"/>
+        </w:rPr>
+        <w:t xml:space="preserve">What Horizon Needs</w:t>
+      </w:r>
+    </w:p>
+    <w:p>
+      <w:pPr>
+        <w:spacing w:after="100" w:before="0"/>
+      </w:pPr>
+      <w:r>
+        <w:rPr>
+          <w:rFonts w:ascii="Calibri" w:cs="Calibri" w:eastAsia="Calibri" w:hAnsi="Calibri"/>
+          <w:b w:val="false"/>
+          <w:bCs w:val="false"/>
+          <w:i w:val="false"/>
+          <w:iCs w:val="false"/>
+          <w:color w:val="525252"/>
+          <w:sz w:val="21"/>
+          <w:szCs w:val="21"/>
+        </w:rPr>
+        <w:t xml:space="preserve">Horizon BCBS is seeking the right strategic partner to enhance and support its Application Development, Maintenance, Data, and Testing Services — with a clear focus on AI solutions and expertise native to the Horizon environment. This is not a lift-and-shift of existing operations. This is a mandate to fundamentally improve how Horizon’s ~1,000 applications are built, tested, maintained, and operated.</w:t>
+      </w:r>
+    </w:p>
+    <w:p>
+      <w:pPr>
+        <w:spacing w:after="80" w:before="200"/>
+      </w:pPr>
+      <w:r>
+        <w:rPr>
+          <w:rFonts w:ascii="Calibri" w:cs="Calibri" w:eastAsia="Calibri" w:hAnsi="Calibri"/>
+          <w:b/>
+          <w:bCs/>
+          <w:i w:val="false"/>
+          <w:iCs w:val="false"/>
+          <w:color w:val="001141"/>
+          <w:sz w:val="24"/>
+          <w:szCs w:val="24"/>
+        </w:rPr>
+        <w:t xml:space="preserve">Service Transformation Goals</w:t>
+      </w:r>
+    </w:p>
+    <w:p>
+      <w:pPr>
+        <w:pStyle w:val="ListParagraph"/>
+        <w:numPr>
+          <w:ilvl w:val="0"/>
+          <w:numId w:val="1"/>
+        </w:numPr>
+        <w:spacing w:after="60" w:before="20"/>
+      </w:pPr>
+      <w:r>
+        <w:rPr>
+          <w:rFonts w:ascii="Calibri" w:cs="Calibri" w:eastAsia="Calibri" w:hAnsi="Calibri"/>
+          <w:b w:val="false"/>
+          <w:bCs w:val="false"/>
+          <w:i w:val="false"/>
+          <w:iCs w:val="false"/>
+          <w:color w:val="525252"/>
+          <w:sz w:val="21"/>
+          <w:szCs w:val="21"/>
+        </w:rPr>
+        <w:t xml:space="preserve">High-quality services delivered through AI and automation to achieve operational efficiencies across all AMS towers.</w:t>
+      </w:r>
+    </w:p>
+    <w:p>
+      <w:pPr>
+        <w:pStyle w:val="ListParagraph"/>
+        <w:numPr>
+          <w:ilvl w:val="0"/>
+          <w:numId w:val="1"/>
+        </w:numPr>
+        <w:spacing w:after="60" w:before="20"/>
+      </w:pPr>
+      <w:r>
+        <w:rPr>
+          <w:rFonts w:ascii="Calibri" w:cs="Calibri" w:eastAsia="Calibri" w:hAnsi="Calibri"/>
+          <w:b w:val="false"/>
+          <w:bCs w:val="false"/>
+          <w:i w:val="false"/>
+          <w:iCs w:val="false"/>
+          <w:color w:val="525252"/>
+          <w:sz w:val="21"/>
+          <w:szCs w:val="21"/>
+        </w:rPr>
+        <w:t xml:space="preserve">Realization of a product-oriented operating model aligned to Horizon’s business domains — Claims, Enrollment, Member, Provider, Data.</w:t>
+      </w:r>
+    </w:p>
+    <w:p>
+      <w:pPr>
+        <w:pStyle w:val="ListParagraph"/>
+        <w:numPr>
+          <w:ilvl w:val="0"/>
+          <w:numId w:val="1"/>
+        </w:numPr>
+        <w:spacing w:after="60" w:before="20"/>
+      </w:pPr>
+      <w:r>
+        <w:rPr>
+          <w:rFonts w:ascii="Calibri" w:cs="Calibri" w:eastAsia="Calibri" w:hAnsi="Calibri"/>
+          <w:b w:val="false"/>
+          <w:bCs w:val="false"/>
+          <w:i w:val="false"/>
+          <w:iCs w:val="false"/>
+          <w:color w:val="525252"/>
+          <w:sz w:val="21"/>
+          <w:szCs w:val="21"/>
+        </w:rPr>
+        <w:t xml:space="preserve">Focused automation — especially in testing and quality engineering — to measurably reduce cost and accelerate delivery cadence.</w:t>
+      </w:r>
+    </w:p>
+    <w:p>
+      <w:pPr>
+        <w:pStyle w:val="ListParagraph"/>
+        <w:numPr>
+          <w:ilvl w:val="0"/>
+          <w:numId w:val="1"/>
+        </w:numPr>
+        <w:spacing w:after="60" w:before="20"/>
+      </w:pPr>
+      <w:r>
+        <w:rPr>
+          <w:rFonts w:ascii="Calibri" w:cs="Calibri" w:eastAsia="Calibri" w:hAnsi="Calibri"/>
+          <w:b w:val="false"/>
+          <w:bCs w:val="false"/>
+          <w:i w:val="false"/>
+          <w:iCs w:val="false"/>
+          <w:color w:val="525252"/>
+          <w:sz w:val="21"/>
+          <w:szCs w:val="21"/>
+        </w:rPr>
+        <w:t xml:space="preserve">AI tools to drive Agile application modernization across the ~1,000-application portfolio.</w:t>
+      </w:r>
+    </w:p>
+    <w:p>
+      <w:pPr>
+        <w:pStyle w:val="ListParagraph"/>
+        <w:numPr>
+          <w:ilvl w:val="0"/>
+          <w:numId w:val="1"/>
+        </w:numPr>
+        <w:spacing w:after="60" w:before="20"/>
+      </w:pPr>
+      <w:r>
+        <w:rPr>
+          <w:rFonts w:ascii="Calibri" w:cs="Calibri" w:eastAsia="Calibri" w:hAnsi="Calibri"/>
+          <w:b w:val="false"/>
+          <w:bCs w:val="false"/>
+          <w:i w:val="false"/>
+          <w:iCs w:val="false"/>
+          <w:color w:val="525252"/>
+          <w:sz w:val="21"/>
+          <w:szCs w:val="21"/>
+        </w:rPr>
+        <w:t xml:space="preserve">Consultative support applying deep healthcare payer best practices — not generic IT outsourcing patterns.</w:t>
+      </w:r>
+    </w:p>
+    <w:p>
+      <w:pPr>
+        <w:spacing w:after="80" w:before="200"/>
+      </w:pPr>
+      <w:r>
+        <w:rPr>
+          <w:rFonts w:ascii="Calibri" w:cs="Calibri" w:eastAsia="Calibri" w:hAnsi="Calibri"/>
+          <w:b/>
+          <w:bCs/>
+          <w:i w:val="false"/>
+          <w:iCs w:val="false"/>
+          <w:color w:val="001141"/>
+          <w:sz w:val="24"/>
+          <w:szCs w:val="24"/>
+        </w:rPr>
+        <w:t xml:space="preserve">Cost Structure Expectations</w:t>
+      </w:r>
+    </w:p>
+    <w:p>
+      <w:pPr>
+        <w:spacing w:after="100" w:before="0"/>
+      </w:pPr>
+      <w:r>
+        <w:rPr>
+          <w:rFonts w:ascii="Calibri" w:cs="Calibri" w:eastAsia="Calibri" w:hAnsi="Calibri"/>
+          <w:b w:val="false"/>
+          <w:bCs w:val="false"/>
+          <w:i w:val="false"/>
+          <w:iCs w:val="false"/>
+          <w:color w:val="525252"/>
+          <w:sz w:val="21"/>
+          <w:szCs w:val="21"/>
+        </w:rPr>
+        <w:t xml:space="preserve">Horizon expects structural cost reduction — not just efficiency gains. The fixed baseline model signals a clear expectation: year-over-year productivity improvements and cost takeout driven by automation and AI, not rate arbitrage. IBM’s response is designed around technology-driven compression: every dollar saved through automation is a permanent reduction, not a temporary deferral.</w:t>
+      </w:r>
+    </w:p>
+    <w:p>
+      <w:pPr>
+        <w:spacing w:after="80" w:before="200"/>
+      </w:pPr>
+      <w:r>
+        <w:rPr>
+          <w:rFonts w:ascii="Calibri" w:cs="Calibri" w:eastAsia="Calibri" w:hAnsi="Calibri"/>
+          <w:b/>
+          <w:bCs/>
+          <w:i w:val="false"/>
+          <w:iCs w:val="false"/>
+          <w:color w:val="001141"/>
+          <w:sz w:val="24"/>
+          <w:szCs w:val="24"/>
+        </w:rPr>
+        <w:t xml:space="preserve">Factors That Shaped IBM’s Solution</w:t>
+      </w:r>
+    </w:p>
+    <w:p>
+      <w:pPr>
+        <w:spacing w:after="40" w:before="120"/>
+      </w:pPr>
+      <w:r>
+        <w:rPr>
+          <w:rFonts w:ascii="Calibri" w:cs="Calibri" w:eastAsia="Calibri" w:hAnsi="Calibri"/>
+          <w:b/>
+          <w:bCs/>
+          <w:i w:val="false"/>
+          <w:iCs w:val="false"/>
+          <w:color w:val="0F62FE"/>
+          <w:sz w:val="21"/>
+          <w:szCs w:val="21"/>
+        </w:rPr>
+        <w:t xml:space="preserve">End-to-End Integrated Delivery</w:t>
+      </w:r>
+    </w:p>
+    <w:p>
+      <w:pPr>
+        <w:spacing w:after="100" w:before="0"/>
+      </w:pPr>
+      <w:r>
+        <w:rPr>
+          <w:rFonts w:ascii="Calibri" w:cs="Calibri" w:eastAsia="Calibri" w:hAnsi="Calibri"/>
+          <w:b w:val="false"/>
+          <w:bCs w:val="false"/>
+          <w:i w:val="false"/>
+          <w:iCs w:val="false"/>
+          <w:color w:val="525252"/>
+          <w:sz w:val="21"/>
+          <w:szCs w:val="21"/>
+        </w:rPr>
+        <w:t xml:space="preserve">A unified operating model across Application Maintenance, Development, Testing, and Data — reducing fragmentation and improving accountability across the full lifecycle. No tower silos. No handoff gaps. One team, one backlog, one set of outcomes.</w:t>
+      </w:r>
+    </w:p>
+    <w:p>
+      <w:pPr>
+        <w:spacing w:after="40" w:before="120"/>
+      </w:pPr>
+      <w:r>
+        <w:rPr>
+          <w:rFonts w:ascii="Calibri" w:cs="Calibri" w:eastAsia="Calibri" w:hAnsi="Calibri"/>
+          <w:b/>
+          <w:bCs/>
+          <w:i w:val="false"/>
+          <w:iCs w:val="false"/>
+          <w:color w:val="0F62FE"/>
+          <w:sz w:val="21"/>
+          <w:szCs w:val="21"/>
+        </w:rPr>
+        <w:t xml:space="preserve">AI at the Core — Not Bolted On</w:t>
+      </w:r>
+    </w:p>
+    <w:p>
+      <w:pPr>
+        <w:spacing w:after="100" w:before="0"/>
+      </w:pPr>
+      <w:r>
+        <w:rPr>
+          <w:rFonts w:ascii="Calibri" w:cs="Calibri" w:eastAsia="Calibri" w:hAnsi="Calibri"/>
+          <w:b w:val="false"/>
+          <w:bCs w:val="false"/>
+          <w:i w:val="false"/>
+          <w:iCs w:val="false"/>
+          <w:color w:val="525252"/>
+          <w:sz w:val="21"/>
+          <w:szCs w:val="21"/>
+        </w:rPr>
+        <w:t xml:space="preserve">AI is embedded in triage, root cause analysis, resolution, test automation, and continuous validation — from the first day of delivery. IBM does not propose adding AI tools to an existing operating model. IBM proposes a new operating model where AI is the foundation.</w:t>
+      </w:r>
+    </w:p>
+    <w:p>
+      <w:pPr>
+        <w:spacing w:after="40" w:before="120"/>
+      </w:pPr>
+      <w:r>
+        <w:rPr>
+          <w:rFonts w:ascii="Calibri" w:cs="Calibri" w:eastAsia="Calibri" w:hAnsi="Calibri"/>
+          <w:b/>
+          <w:bCs/>
+          <w:i w:val="false"/>
+          <w:iCs w:val="false"/>
+          <w:color w:val="0F62FE"/>
+          <w:sz w:val="21"/>
+          <w:szCs w:val="21"/>
+        </w:rPr>
+        <w:t xml:space="preserve">Transition Without Disruption</w:t>
+      </w:r>
+    </w:p>
+    <w:p>
+      <w:pPr>
+        <w:spacing w:after="100" w:before="0"/>
+      </w:pPr>
+      <w:r>
+        <w:rPr>
+          <w:rFonts w:ascii="Calibri" w:cs="Calibri" w:eastAsia="Calibri" w:hAnsi="Calibri"/>
+          <w:b w:val="false"/>
+          <w:bCs w:val="false"/>
+          <w:i w:val="false"/>
+          <w:iCs w:val="false"/>
+          <w:color w:val="525252"/>
+          <w:sz w:val="21"/>
+          <w:szCs w:val="21"/>
+        </w:rPr>
+        <w:t xml:space="preserve">IBM’s phased transition approach maintains seamless service continuity while progressively modernizing the underlying operating model. Zero production disruption. Zero member impact. Zero learning curve at Horizon’s expense.</w:t>
+      </w:r>
+    </w:p>
+    <w:p>
+      <w:pPr>
+        <w:spacing w:after="40" w:before="120"/>
+      </w:pPr>
+      <w:r>
+        <w:rPr>
+          <w:rFonts w:ascii="Calibri" w:cs="Calibri" w:eastAsia="Calibri" w:hAnsi="Calibri"/>
+          <w:b/>
+          <w:bCs/>
+          <w:i w:val="false"/>
+          <w:iCs w:val="false"/>
+          <w:color w:val="0F62FE"/>
+          <w:sz w:val="21"/>
+          <w:szCs w:val="21"/>
+        </w:rPr>
+        <w:t xml:space="preserve">Open, Elastic Architecture</w:t>
+      </w:r>
+    </w:p>
+    <w:p>
+      <w:pPr>
+        <w:spacing w:after="100" w:before="0"/>
+      </w:pPr>
+      <w:r>
+        <w:rPr>
+          <w:rFonts w:ascii="Calibri" w:cs="Calibri" w:eastAsia="Calibri" w:hAnsi="Calibri"/>
+          <w:b w:val="false"/>
+          <w:bCs w:val="false"/>
+          <w:i w:val="false"/>
+          <w:iCs w:val="false"/>
+          <w:color w:val="525252"/>
+          <w:sz w:val="21"/>
+          <w:szCs w:val="21"/>
+        </w:rPr>
+        <w:t xml:space="preserve">Plug-and-play architecture deploys on Horizon’s existing AWS stack — avoiding lock-in and enabling flexibility across cloud ecosystems. Built for Horizon’s technology choices, not IBM’s.</w:t>
+      </w:r>
+    </w:p>
+    <w:p>
+      <w:pPr>
+        <w:spacing w:after="120" w:before="0"/>
+      </w:pPr>
+      <w:r>
+        <w:rPr>
+          <w:rFonts w:ascii="Calibri" w:cs="Calibri" w:eastAsia="Calibri" w:hAnsi="Calibri"/>
+          <w:sz w:val="12"/>
+          <w:szCs w:val="12"/>
+        </w:rPr>
+        <w:t xml:space="preserve"/>
+      </w:r>
+    </w:p>
+    <w:p>
+      <w:pPr>
+        <w:spacing w:after="80" w:before="0"/>
+      </w:pPr>
+      <w:r>
+        <w:rPr>
+          <w:rFonts w:ascii="Calibri" w:cs="Calibri" w:eastAsia="Calibri" w:hAnsi="Calibri"/>
+          <w:sz w:val="12"/>
+          <w:szCs w:val="12"/>
+        </w:rPr>
+        <w:t xml:space="preserve"/>
+      </w:r>
+    </w:p>
+    <w:p>
+      <w:pPr>
+        <w:pBdr>
+          <w:left w:val="single" w:color="0F62FE" w:sz="20" w:space="12"/>
+        </w:pBdr>
+        <w:spacing w:after="40" w:before="60"/>
+        <w:ind w:left="576"/>
+      </w:pPr>
+      <w:r>
+        <w:rPr>
+          <w:rFonts w:ascii="Calibri" w:cs="Calibri" w:eastAsia="Calibri" w:hAnsi="Calibri"/>
+          <w:b w:val="false"/>
+          <w:bCs w:val="false"/>
+          <w:i/>
+          <w:iCs/>
+          <w:color w:val="001141"/>
+          <w:sz w:val="23"/>
+          <w:szCs w:val="23"/>
+        </w:rPr>
         <w:t xml:space="preserve">“IBM’s solution shifts Horizon from reactive incident management to predictive, autonomous operations — where the member never feels the friction and the provider never waits.”</w:t>
       </w:r>
     </w:p>
@@ -2942,7 +3096,7 @@
           <w:sz w:val="19"/>
           <w:szCs w:val="19"/>
         </w:rPr>
-        <w:t xml:space="preserve">All current-state estimates are directional and will be formally baselined during SOW phase. IBM’s committed targets will be contractually agreed at programme commencement.</w:t>
+        <w:t xml:space="preserve">All current-state estimates are directional and will be formally baselined during SOW phase. IBM’s committed targets will be contractually agreed at programme commencement. See Appendix for the complete initiative portfolio.</w:t>
       </w:r>
     </w:p>
     <w:tbl>
@@ -4489,6 +4643,24 @@
     </w:p>
     <w:p>
       <w:pPr>
+        <w:spacing w:after="100" w:before="0"/>
+      </w:pPr>
+      <w:r>
+        <w:rPr>
+          <w:rFonts w:ascii="Calibri" w:cs="Calibri" w:eastAsia="Calibri" w:hAnsi="Calibri"/>
+          <w:b w:val="false"/>
+          <w:bCs w:val="false"/>
+          <w:i w:val="false"/>
+          <w:iCs w:val="false"/>
+          <w:color w:val="525252"/>
+          <w:sz w:val="21"/>
+          <w:szCs w:val="21"/>
+        </w:rPr>
+        <w:t xml:space="preserve">Across Horizon’s ~1,000-application estate, IBM’s development model delivers measurable improvement in speed, quality, and cost — without adding headcount. The model is designed to compound: every sprint produces not just features, but better tooling, better patterns, and better institutional knowledge.</w:t>
+      </w:r>
+    </w:p>
+    <w:p>
+      <w:pPr>
         <w:spacing w:after="40" w:before="120"/>
       </w:pPr>
       <w:r>
@@ -4520,7 +4692,7 @@
           <w:sz w:val="21"/>
           <w:szCs w:val="21"/>
         </w:rPr>
-        <w:t xml:space="preserve">Generative AI tools accelerate code generation, review, documentation, and optimization. Developer throughput increases 25–35% without adding headcount. Every engineer spends more time on high-value problem-solving and less on repetitive scaffolding.</w:t>
+        <w:t xml:space="preserve">Generative AI tools accelerate code generation, review, documentation, and optimization. Developer throughput increases 25–35% without adding headcount. Every engineer spends more time on high-value problem-solving and less on repetitive scaffolding. IBM Consulting Advantage accelerators — a portfolio of 6,500+ production-tested assets — compress time-to-value for common patterns.</w:t>
       </w:r>
     </w:p>
     <w:p>
@@ -4556,7 +4728,7 @@
           <w:sz w:val="21"/>
           <w:szCs w:val="21"/>
         </w:rPr>
-        <w:t xml:space="preserve">Security is embedded left into CI/CD pipelines. Automated vulnerability scanning runs at every stage. Compliance gates and policy enforcement operate from commit to production — no manual security review bottlenecks.</w:t>
+        <w:t xml:space="preserve">Security is embedded left into CI/CD pipelines. Automated vulnerability scanning runs at every stage. Compliance gates and policy enforcement operate from commit to production — no manual security review bottlenecks. HIPAA, CMS, and PCI compliance checks are automated, not manual.</w:t>
       </w:r>
     </w:p>
     <w:p>
@@ -4592,7 +4764,7 @@
           <w:sz w:val="21"/>
           <w:szCs w:val="21"/>
         </w:rPr>
-        <w:t xml:space="preserve">Teams align to Horizon’s business domains — Claims, Enrollment, Member Services, Provider Operations. Context stays with the squad. Handoff overhead disappears. Accountability is end-to-end.</w:t>
+        <w:t xml:space="preserve">Teams align to Horizon’s business domains — Claims, Enrollment, Member Services, Provider Operations, Data &amp; Analytics. Context stays with the squad. Handoff overhead disappears. Accountability is end-to-end. A claims developer understands claims — not just code.</w:t>
       </w:r>
     </w:p>
     <w:p>
@@ -4628,12 +4800,48 @@
           <w:sz w:val="21"/>
           <w:szCs w:val="21"/>
         </w:rPr>
-        <w:t xml:space="preserve">Every deployment passes through AI-scored gates: security posture, test coverage, performance regression, and historical failure patterns. Low-risk changes deploy without human approval cycles. High-risk changes trigger additional validation — automatically.</w:t>
-      </w:r>
-    </w:p>
-    <w:p>
-      <w:pPr>
-        <w:spacing w:after="80" w:before="0"/>
+        <w:t xml:space="preserve">Every deployment passes through AI-scored gates: security posture, test coverage, performance regression, and historical failure patterns. Low-risk changes deploy without human approval cycles. High-risk changes trigger additional validation — automatically. The result: faster delivery with fewer production incidents.</w:t>
+      </w:r>
+    </w:p>
+    <w:p>
+      <w:pPr>
+        <w:spacing w:after="40" w:before="120"/>
+      </w:pPr>
+      <w:r>
+        <w:rPr>
+          <w:rFonts w:ascii="Calibri" w:cs="Calibri" w:eastAsia="Calibri" w:hAnsi="Calibri"/>
+          <w:b/>
+          <w:bCs/>
+          <w:i w:val="false"/>
+          <w:iCs w:val="false"/>
+          <w:color w:val="0F62FE"/>
+          <w:sz w:val="21"/>
+          <w:szCs w:val="21"/>
+        </w:rPr>
+        <w:t xml:space="preserve">Modernization in Stride</w:t>
+      </w:r>
+    </w:p>
+    <w:p>
+      <w:pPr>
+        <w:spacing w:after="100" w:before="0"/>
+      </w:pPr>
+      <w:r>
+        <w:rPr>
+          <w:rFonts w:ascii="Calibri" w:cs="Calibri" w:eastAsia="Calibri" w:hAnsi="Calibri"/>
+          <w:b w:val="false"/>
+          <w:bCs w:val="false"/>
+          <w:i w:val="false"/>
+          <w:iCs w:val="false"/>
+          <w:color w:val="525252"/>
+          <w:sz w:val="21"/>
+          <w:szCs w:val="21"/>
+        </w:rPr>
+        <w:t xml:space="preserve">Modernization is not a separate capital programme. It is embedded into every sprint — a refactor, an API wrap, a library upgrade, a legacy dependency removed. The application estate improves continuously without a disruptive parallel programme or separate budget request.</w:t>
+      </w:r>
+    </w:p>
+    <w:p>
+      <w:pPr>
+        <w:spacing w:after="120" w:before="0"/>
       </w:pPr>
       <w:r>
         <w:rPr>
@@ -4666,7 +4874,7 @@
     </w:p>
     <w:p>
       <w:pPr>
-        <w:spacing w:after="120" w:before="0"/>
+        <w:spacing w:after="160" w:before="0"/>
       </w:pPr>
       <w:r>
         <w:rPr>
@@ -5766,7 +5974,25 @@
           <w:sz w:val="21"/>
           <w:szCs w:val="21"/>
         </w:rPr>
-        <w:t xml:space="preserve">IBM’s AIOps framework is built on a multi-agent architecture where specialized AI agents handle distinct responsibilities across the incident lifecycle — from detection through resolution and continuous learning. Each agent compounds knowledge with every resolved incident.</w:t>
+        <w:t xml:space="preserve">IBM’s AIOps framework is built on a multi-agent architecture where specialized AI agents handle distinct responsibilities across the incident lifecycle — from detection through resolution and continuous learning. Each agent compounds knowledge with every resolved incident. Across Horizon’s ~1,000 applications, this architecture replaces reactive human triage with proactive, autonomous intelligence.</w:t>
+      </w:r>
+    </w:p>
+    <w:p>
+      <w:pPr>
+        <w:spacing w:after="100" w:before="0"/>
+      </w:pPr>
+      <w:r>
+        <w:rPr>
+          <w:rFonts w:ascii="Calibri" w:cs="Calibri" w:eastAsia="Calibri" w:hAnsi="Calibri"/>
+          <w:b w:val="false"/>
+          <w:bCs w:val="false"/>
+          <w:i w:val="false"/>
+          <w:iCs w:val="false"/>
+          <w:color w:val="525252"/>
+          <w:sz w:val="21"/>
+          <w:szCs w:val="21"/>
+        </w:rPr>
+        <w:t xml:space="preserve">The architecture is built on Horizon’s existing AWS stack — AWS AgentCore &amp; Bedrock at the agent layer, AWS Bedrock with native Guardrails at the model layer, ElasticSearch and PostgreSQL for vector storage, and integrations with ServiceNow, CloudWatch, OpenShift, Splunk, and Horizon’s Anomaly Framework.</w:t>
       </w:r>
     </w:p>
     <w:p>
@@ -5820,7 +6046,7 @@
           <w:sz w:val="21"/>
           <w:szCs w:val="21"/>
         </w:rPr>
-        <w:t xml:space="preserve">Delivers context-aware guidance and automated actions to help users auto-resolve issues before ticket creation. The member gets their answer without waiting for a human.</w:t>
+        <w:t xml:space="preserve">Delivers context-aware guidance and automated actions to help users auto-resolve issues before ticket creation. The member gets their answer without waiting for a human. The provider’s portal issue is resolved before it becomes a support call.</w:t>
       </w:r>
     </w:p>
     <w:p>
@@ -5856,7 +6082,7 @@
           <w:sz w:val="21"/>
           <w:szCs w:val="21"/>
         </w:rPr>
-        <w:t xml:space="preserve">Prioritizes tickets based on impact, urgency, and historical patterns — eliminating manual queue management. The right team responds immediately, every time.</w:t>
+        <w:t xml:space="preserve">Prioritizes tickets based on impact, urgency, and historical patterns — eliminating manual queue management. The right team responds immediately, every time. A P1 claims outage is routed to the claims pod in seconds, not minutes.</w:t>
       </w:r>
     </w:p>
     <w:p>
@@ -5892,7 +6118,7 @@
           <w:sz w:val="21"/>
           <w:szCs w:val="21"/>
         </w:rPr>
-        <w:t xml:space="preserve">Correlates signals across 140+ monitoring sources to identify root cause within minutes — not hours. Diagnosis that used to take a senior engineer now takes an AI agent seconds.</w:t>
+        <w:t xml:space="preserve">Correlates signals across 140+ monitoring sources to identify root cause within minutes — not hours. Diagnosis that used to take a senior engineer now takes an AI agent seconds. Cross-system dependencies are mapped and traced automatically.</w:t>
       </w:r>
     </w:p>
     <w:p>
@@ -5928,7 +6154,7 @@
           <w:sz w:val="21"/>
           <w:szCs w:val="21"/>
         </w:rPr>
-        <w:t xml:space="preserve">Suggests or executes remediation steps based on runbooks and past resolutions. More than 74% of P3/P4 incidents are resolved without human action.</w:t>
+        <w:t xml:space="preserve">Suggests or executes remediation steps based on runbooks and past resolutions. More than 74% of P3/P4 incidents are resolved without human action. The provider never knows the system hiccupped. The member never feels the impact.</w:t>
       </w:r>
     </w:p>
     <w:p>
@@ -5964,7 +6190,7 @@
           <w:sz w:val="21"/>
           <w:szCs w:val="21"/>
         </w:rPr>
-        <w:t xml:space="preserve">Auto-generates and updates runbooks from resolved incidents — compounding operational knowledge over time and eliminating reliance on institutional memory.</w:t>
+        <w:t xml:space="preserve">Auto-generates and updates runbooks from resolved incidents — compounding operational knowledge over time and eliminating reliance on institutional memory. When a senior engineer leaves, the knowledge stays.</w:t>
       </w:r>
     </w:p>
     <w:p>
@@ -6000,12 +6226,12 @@
           <w:sz w:val="21"/>
           <w:szCs w:val="21"/>
         </w:rPr>
-        <w:t xml:space="preserve">Feeds production telemetry back into all agents, ensuring progressive improvement with every incident cycle. The system gets smarter every day.</w:t>
-      </w:r>
-    </w:p>
-    <w:p>
-      <w:pPr>
-        <w:spacing w:after="80" w:before="0"/>
+        <w:t xml:space="preserve">Feeds production telemetry back into all agents, ensuring progressive improvement with every incident cycle. The system gets smarter every day. Month 12 operations are fundamentally more capable than Month 1.</w:t>
+      </w:r>
+    </w:p>
+    <w:p>
+      <w:pPr>
+        <w:spacing w:after="120" w:before="0"/>
       </w:pPr>
       <w:r>
         <w:rPr>
@@ -7879,6 +8105,24 @@
     </w:p>
     <w:p>
       <w:pPr>
+        <w:spacing w:after="100" w:before="0"/>
+      </w:pPr>
+      <w:r>
+        <w:rPr>
+          <w:rFonts w:ascii="Calibri" w:cs="Calibri" w:eastAsia="Calibri" w:hAnsi="Calibri"/>
+          <w:b w:val="false"/>
+          <w:bCs w:val="false"/>
+          <w:i w:val="false"/>
+          <w:iCs w:val="false"/>
+          <w:color w:val="525252"/>
+          <w:sz w:val="21"/>
+          <w:szCs w:val="21"/>
+        </w:rPr>
+        <w:t xml:space="preserve">This is not a testing team. This is a quality engine. It learns from every defect, tightens the net with every release, and ensures that the quality of Horizon’s ~1,000 applications improves continuously — without manual test plan authoring or regression suite maintenance.</w:t>
+      </w:r>
+    </w:p>
+    <w:p>
+      <w:pPr>
         <w:spacing w:after="80" w:before="200"/>
       </w:pPr>
       <w:r>
@@ -7915,7 +8159,7 @@
           <w:sz w:val="21"/>
           <w:szCs w:val="21"/>
         </w:rPr>
-        <w:t xml:space="preserve">End-to-end traceability and release readiness visibility.</w:t>
+        <w:t xml:space="preserve">End-to-end traceability from requirement to deployed feature — full release readiness visibility at every gate.</w:t>
       </w:r>
     </w:p>
     <w:p>
@@ -7938,7 +8182,7 @@
           <w:sz w:val="21"/>
           <w:szCs w:val="21"/>
         </w:rPr>
-        <w:t xml:space="preserve">Defect leakage, density, and stability metrics (MTTR).</w:t>
+        <w:t xml:space="preserve">Defect leakage, density, and stability metrics (MTTR) tracked per domain and per application.</w:t>
       </w:r>
     </w:p>
     <w:p>
@@ -7961,7 +8205,7 @@
           <w:sz w:val="21"/>
           <w:szCs w:val="21"/>
         </w:rPr>
-        <w:t xml:space="preserve">Automation coverage with KPI-driven governance.</w:t>
+        <w:t xml:space="preserve">Automation coverage with KPI-driven governance — every sprint measured against coverage targets.</w:t>
       </w:r>
     </w:p>
     <w:p>
@@ -7984,7 +8228,7 @@
           <w:sz w:val="21"/>
           <w:szCs w:val="21"/>
         </w:rPr>
-        <w:t xml:space="preserve">AI-driven defect insights and regression optimization.</w:t>
+        <w:t xml:space="preserve">AI-driven defect insights and regression optimization — models trained on Horizon’s own incident history.</w:t>
       </w:r>
     </w:p>
     <w:p>
@@ -8007,7 +8251,7 @@
           <w:sz w:val="21"/>
           <w:szCs w:val="21"/>
         </w:rPr>
-        <w:t xml:space="preserve">Production telemetry feeding back into test strategy.</w:t>
+        <w:t xml:space="preserve">Production telemetry feeding back into test strategy — every production incident teaches the quality engine.</w:t>
       </w:r>
     </w:p>
     <w:p>
@@ -8043,7 +8287,133 @@
           <w:sz w:val="21"/>
           <w:szCs w:val="21"/>
         </w:rPr>
-        <w:t xml:space="preserve">IBM’s Generative AI capabilities enable self-generating test cases, automated test maintenance, and continuous validation integration — dramatically reducing the cost and time associated with regression testing across Horizon’s complex, multi-system portfolio.</w:t>
+        <w:t xml:space="preserve">IBM’s Generative AI capabilities enable self-generating test cases, automated test maintenance, and continuous validation integration — dramatically reducing the cost and time associated with regression testing across Horizon’s complex, multi-system portfolio. AI synthesises regression, integration, and edge-case tests directly from the code change — at commit speed.</w:t>
+      </w:r>
+    </w:p>
+    <w:p>
+      <w:pPr>
+        <w:spacing w:after="80" w:before="200"/>
+      </w:pPr>
+      <w:r>
+        <w:rPr>
+          <w:rFonts w:ascii="Calibri" w:cs="Calibri" w:eastAsia="Calibri" w:hAnsi="Calibri"/>
+          <w:b/>
+          <w:bCs/>
+          <w:i w:val="false"/>
+          <w:iCs w:val="false"/>
+          <w:color w:val="001141"/>
+          <w:sz w:val="24"/>
+          <w:szCs w:val="24"/>
+        </w:rPr>
+        <w:t xml:space="preserve">AI-Powered Quality Capabilities</w:t>
+      </w:r>
+    </w:p>
+    <w:p>
+      <w:pPr>
+        <w:spacing w:after="40" w:before="120"/>
+      </w:pPr>
+      <w:r>
+        <w:rPr>
+          <w:rFonts w:ascii="Calibri" w:cs="Calibri" w:eastAsia="Calibri" w:hAnsi="Calibri"/>
+          <w:b/>
+          <w:bCs/>
+          <w:i w:val="false"/>
+          <w:iCs w:val="false"/>
+          <w:color w:val="0F62FE"/>
+          <w:sz w:val="21"/>
+          <w:szCs w:val="21"/>
+        </w:rPr>
+        <w:t xml:space="preserve">GenAI Test Generation</w:t>
+      </w:r>
+    </w:p>
+    <w:p>
+      <w:pPr>
+        <w:spacing w:after="100" w:before="0"/>
+      </w:pPr>
+      <w:r>
+        <w:rPr>
+          <w:rFonts w:ascii="Calibri" w:cs="Calibri" w:eastAsia="Calibri" w:hAnsi="Calibri"/>
+          <w:b w:val="false"/>
+          <w:bCs w:val="false"/>
+          <w:i w:val="false"/>
+          <w:iCs w:val="false"/>
+          <w:color w:val="525252"/>
+          <w:sz w:val="21"/>
+          <w:szCs w:val="21"/>
+        </w:rPr>
+        <w:t xml:space="preserve">AI generates test cases from code changes automatically. Coverage grows without manual test-plan authoring. New features ship with tests from Day 1.</w:t>
+      </w:r>
+    </w:p>
+    <w:p>
+      <w:pPr>
+        <w:spacing w:after="40" w:before="120"/>
+      </w:pPr>
+      <w:r>
+        <w:rPr>
+          <w:rFonts w:ascii="Calibri" w:cs="Calibri" w:eastAsia="Calibri" w:hAnsi="Calibri"/>
+          <w:b/>
+          <w:bCs/>
+          <w:i w:val="false"/>
+          <w:iCs w:val="false"/>
+          <w:color w:val="0F62FE"/>
+          <w:sz w:val="21"/>
+          <w:szCs w:val="21"/>
+        </w:rPr>
+        <w:t xml:space="preserve">Defect Prediction AI</w:t>
+      </w:r>
+    </w:p>
+    <w:p>
+      <w:pPr>
+        <w:spacing w:after="100" w:before="0"/>
+      </w:pPr>
+      <w:r>
+        <w:rPr>
+          <w:rFonts w:ascii="Calibri" w:cs="Calibri" w:eastAsia="Calibri" w:hAnsi="Calibri"/>
+          <w:b w:val="false"/>
+          <w:bCs w:val="false"/>
+          <w:i w:val="false"/>
+          <w:iCs w:val="false"/>
+          <w:color w:val="525252"/>
+          <w:sz w:val="21"/>
+          <w:szCs w:val="21"/>
+        </w:rPr>
+        <w:t xml:space="preserve">Models trained on Horizon’s own incident history identify high-risk code paths before they reach UAT — catching defects where they are cheapest to fix.</w:t>
+      </w:r>
+    </w:p>
+    <w:p>
+      <w:pPr>
+        <w:spacing w:after="40" w:before="120"/>
+      </w:pPr>
+      <w:r>
+        <w:rPr>
+          <w:rFonts w:ascii="Calibri" w:cs="Calibri" w:eastAsia="Calibri" w:hAnsi="Calibri"/>
+          <w:b/>
+          <w:bCs/>
+          <w:i w:val="false"/>
+          <w:iCs w:val="false"/>
+          <w:color w:val="0F62FE"/>
+          <w:sz w:val="21"/>
+          <w:szCs w:val="21"/>
+        </w:rPr>
+        <w:t xml:space="preserve">Production Feedback Loop</w:t>
+      </w:r>
+    </w:p>
+    <w:p>
+      <w:pPr>
+        <w:spacing w:after="100" w:before="0"/>
+      </w:pPr>
+      <w:r>
+        <w:rPr>
+          <w:rFonts w:ascii="Calibri" w:cs="Calibri" w:eastAsia="Calibri" w:hAnsi="Calibri"/>
+          <w:b w:val="false"/>
+          <w:bCs w:val="false"/>
+          <w:i w:val="false"/>
+          <w:iCs w:val="false"/>
+          <w:color w:val="525252"/>
+          <w:sz w:val="21"/>
+          <w:szCs w:val="21"/>
+        </w:rPr>
+        <w:t xml:space="preserve">Every production defect teaches the quality engine. Each release cycle the test suite tightens automatically — an ever-improving net that strengthens without manual intervention.</w:t>
       </w:r>
     </w:p>
     <w:p>
@@ -8076,12 +8446,12 @@
           <w:sz w:val="21"/>
           <w:szCs w:val="21"/>
         </w:rPr>
-        <w:t xml:space="preserve">Target: 80% test automation coverage across Horizon’s application portfolio within 12 months of full deployment.</w:t>
-      </w:r>
-    </w:p>
-    <w:p>
-      <w:pPr>
-        <w:spacing w:after="80" w:before="0"/>
+        <w:t xml:space="preserve">Target: 80% test automation coverage across Horizon’s ~1,000-application portfolio within 12 months of full deployment.</w:t>
+      </w:r>
+    </w:p>
+    <w:p>
+      <w:pPr>
+        <w:spacing w:after="120" w:before="0"/>
       </w:pPr>
       <w:r>
         <w:rPr>
@@ -10487,7 +10857,25 @@
           <w:sz w:val="21"/>
           <w:szCs w:val="21"/>
         </w:rPr>
-        <w:t xml:space="preserve">IBM’s CareOps360 platform surfaces real-time visibility into the claims lifecycle — from receipt through adjudication, settlement, and denial management. Operational leads and executives can identify queue bottlenecks, denial spikes, and auto-adjudication performance degradation in real time.</w:t>
+        <w:t xml:space="preserve">Claims and prior authorization are among Horizon’s highest-volume, highest-risk operational domains. IBM embeds AI-driven intelligence to accelerate adjudication, reduce denials, and eliminate manual backlog management — at enterprise scale across the ~1,000-application estate.</w:t>
+      </w:r>
+    </w:p>
+    <w:p>
+      <w:pPr>
+        <w:spacing w:after="100" w:before="0"/>
+      </w:pPr>
+      <w:r>
+        <w:rPr>
+          <w:rFonts w:ascii="Calibri" w:cs="Calibri" w:eastAsia="Calibri" w:hAnsi="Calibri"/>
+          <w:b w:val="false"/>
+          <w:bCs w:val="false"/>
+          <w:i w:val="false"/>
+          <w:iCs w:val="false"/>
+          <w:color w:val="525252"/>
+          <w:sz w:val="21"/>
+          <w:szCs w:val="21"/>
+        </w:rPr>
+        <w:t xml:space="preserve">IBM’s CareOps360 platform surfaces real-time visibility into the claims lifecycle — from receipt through adjudication, settlement, and denial management. Operational leads and executives identify queue bottlenecks, denial spikes, and auto-adjudication performance degradation in real time, without waiting for next-day reporting.</w:t>
       </w:r>
     </w:p>
     <w:p>
@@ -10615,7 +11003,7 @@
           <w:sz w:val="21"/>
           <w:szCs w:val="21"/>
         </w:rPr>
-        <w:t xml:space="preserve">Prior authorization is a significant operational and member experience pressure point. IBM deploys AI-assisted review tooling to triage and prioritise requests, identify auto-approvable cases, and flag clinically complex cases for expedited human review.</w:t>
+        <w:t xml:space="preserve">Prior authorization is a significant operational and member experience pressure point. Horizon’s current backlog and review cycle times create friction for providers and members alike. IBM deploys AI-assisted review tooling to triage and prioritise requests, identify auto-approvable cases, and flag clinically complex cases for expedited human review.</w:t>
       </w:r>
     </w:p>
     <w:tbl>
@@ -12147,6 +12535,60 @@
     </w:p>
     <w:p>
       <w:pPr>
+        <w:spacing w:after="80" w:before="0"/>
+      </w:pPr>
+      <w:r>
+        <w:rPr>
+          <w:rFonts w:ascii="Calibri" w:cs="Calibri" w:eastAsia="Calibri" w:hAnsi="Calibri"/>
+          <w:sz w:val="12"/>
+          <w:szCs w:val="12"/>
+        </w:rPr>
+        <w:t xml:space="preserve"/>
+      </w:r>
+    </w:p>
+    <w:p>
+      <w:pPr>
+        <w:pBdr>
+          <w:left w:val="single" w:color="0F62FE" w:sz="20" w:space="12"/>
+        </w:pBdr>
+        <w:spacing w:after="40" w:before="60"/>
+        <w:ind w:left="576"/>
+      </w:pPr>
+      <w:r>
+        <w:rPr>
+          <w:rFonts w:ascii="Calibri" w:cs="Calibri" w:eastAsia="Calibri" w:hAnsi="Calibri"/>
+          <w:b w:val="false"/>
+          <w:bCs w:val="false"/>
+          <w:i/>
+          <w:iCs/>
+          <w:color w:val="001141"/>
+          <w:sz w:val="23"/>
+          <w:szCs w:val="23"/>
+        </w:rPr>
+        <w:t xml:space="preserve">“Horizon’s leadership should never have to ask ‘how are we doing?’ and wait for a deck. The answer should be live, accurate, and one click away — every hour of every day. That is what CareOps360 delivers.”</w:t>
+      </w:r>
+    </w:p>
+    <w:p>
+      <w:pPr>
+        <w:spacing w:after="120" w:before="0"/>
+        <w:jc w:val="right"/>
+      </w:pPr>
+      <w:r>
+        <w:rPr>
+          <w:rFonts w:ascii="Calibri" w:cs="Calibri" w:eastAsia="Calibri" w:hAnsi="Calibri"/>
+          <w:b/>
+          <w:bCs/>
+          <w:i w:val="false"/>
+          <w:iCs w:val="false"/>
+          <w:color w:val="0F62FE"/>
+          <w:sz w:val="18"/>
+          <w:szCs w:val="18"/>
+        </w:rPr>
+        <w:t xml:space="preserve">— IBM Consulting — Executive Visibility</w:t>
+      </w:r>
+    </w:p>
+    <w:p>
+      <w:pPr>
         <w:spacing w:after="80" w:before="200"/>
       </w:pPr>
       <w:r>
@@ -12178,7 +12620,7 @@
           <w:sz w:val="21"/>
           <w:szCs w:val="21"/>
         </w:rPr>
-        <w:t xml:space="preserve">CareOps360 is IBM’s production-grade executive operations platform purpose-built for the Horizon BCBS engagement. It delivers real-time operational intelligence across all AMS towers — enrollment, claims, applications, infrastructure, and quality — through a single, unified command center accessible to Horizon’s executive and operational leadership.</w:t>
+        <w:t xml:space="preserve">CareOps360 is IBM’s production-grade executive operations platform purpose-built for the Horizon BCBS engagement. It delivers real-time operational intelligence across all AMS towers — enrollment, claims, applications, infrastructure, and quality — through a single, unified command center accessible to Horizon’s executive and operational leadership. The platform is architecture-ready for live production data and is currently deployed in a production-equivalent environment.</w:t>
       </w:r>
     </w:p>
     <w:p>
@@ -12196,7 +12638,7 @@
           <w:sz w:val="21"/>
           <w:szCs w:val="21"/>
         </w:rPr>
-        <w:t xml:space="preserve">Built on IBM’s AIOps observability framework, CareOps360 surfaces predictive insights, SLA performance, enrollment intelligence, digital front door metrics, and transformation roadmap progress — eliminating the need for manual reporting aggregation.</w:t>
+        <w:t xml:space="preserve">Built on IBM’s AIOps observability framework, CareOps360 surfaces predictive insights, SLA performance, enrollment intelligence, digital front door metrics, and transformation roadmap progress — eliminating the need for manual reporting aggregation. No more quarterly decks. No more manual data pulls. Live data, always.</w:t>
       </w:r>
     </w:p>
     <w:p>
@@ -12260,7 +12702,7 @@
           <w:sz w:val="21"/>
           <w:szCs w:val="21"/>
         </w:rPr>
-        <w:t xml:space="preserve">Application Health — 500+ app inventory, incident register, availability trends.</w:t>
+        <w:t xml:space="preserve">Application Health — ~1,000 app inventory, incident register, availability trends.</w:t>
       </w:r>
     </w:p>
     <w:p>
@@ -14297,6 +14739,24 @@
     </w:p>
     <w:p>
       <w:pPr>
+        <w:spacing w:after="100" w:before="0"/>
+      </w:pPr>
+      <w:r>
+        <w:rPr>
+          <w:rFonts w:ascii="Calibri" w:cs="Calibri" w:eastAsia="Calibri" w:hAnsi="Calibri"/>
+          <w:b w:val="false"/>
+          <w:bCs w:val="false"/>
+          <w:i w:val="false"/>
+          <w:iCs w:val="false"/>
+          <w:color w:val="525252"/>
+          <w:sz w:val="21"/>
+          <w:szCs w:val="21"/>
+        </w:rPr>
+        <w:t xml:space="preserve">IBM’s governance model ensures continuous accountability from the operational team to the boardroom. Every metric is live in CareOps360 — no manual reporting, no quarterly surprises.</w:t>
+      </w:r>
+    </w:p>
+    <w:p>
+      <w:pPr>
         <w:pStyle w:val="ListParagraph"/>
         <w:numPr>
           <w:ilvl w:val="0"/>
@@ -14315,7 +14775,7 @@
           <w:sz w:val="21"/>
           <w:szCs w:val="21"/>
         </w:rPr>
-        <w:t xml:space="preserve">Executive Steering Committee: Quarterly IBM VP + Horizon CIO/COO review.</w:t>
+        <w:t xml:space="preserve">Executive Steering Committee: Quarterly IBM VP + Horizon CIO/COO review — strategic direction, value realization, and programme health.</w:t>
       </w:r>
     </w:p>
     <w:p>
@@ -14338,7 +14798,7 @@
           <w:sz w:val="21"/>
           <w:szCs w:val="21"/>
         </w:rPr>
-        <w:t xml:space="preserve">Program Management Office: Monthly health reporting and risk register.</w:t>
+        <w:t xml:space="preserve">Program Management Office: Monthly health reporting and risk register — every initiative tracked against milestones.</w:t>
       </w:r>
     </w:p>
     <w:p>
@@ -14361,7 +14821,7 @@
           <w:sz w:val="21"/>
           <w:szCs w:val="21"/>
         </w:rPr>
-        <w:t xml:space="preserve">Delivery Operations Reviews: Bi-weekly SLA and incident trends.</w:t>
+        <w:t xml:space="preserve">Delivery Operations Reviews: Bi-weekly SLA and incident trends — operational cadence with the teams doing the work.</w:t>
       </w:r>
     </w:p>
     <w:p>
@@ -14384,7 +14844,7 @@
           <w:sz w:val="21"/>
           <w:szCs w:val="21"/>
         </w:rPr>
-        <w:t xml:space="preserve">Financial Governance: Monthly actuals vs. committed model.</w:t>
+        <w:t xml:space="preserve">Financial Governance: Monthly actuals vs. committed model — cost takeout tracked to the dollar.</w:t>
       </w:r>
     </w:p>
     <w:p>
@@ -14407,7 +14867,7 @@
           <w:sz w:val="21"/>
           <w:szCs w:val="21"/>
         </w:rPr>
-        <w:t xml:space="preserve">Innovation Council: Quarterly idea pipeline and prioritization.</w:t>
+        <w:t xml:space="preserve">Innovation Council: Quarterly idea pipeline and prioritization — business-case-backed innovation at Horizon’s direction.</w:t>
       </w:r>
     </w:p>
     <w:p>
@@ -14461,7 +14921,7 @@
           <w:sz w:val="21"/>
           <w:szCs w:val="21"/>
         </w:rPr>
-        <w:t xml:space="preserve">60 total initiatives across 3 delivery years.</w:t>
+        <w:t xml:space="preserve">60 total initiatives across 3 delivery years — across Payer, Clinical, Digital, and Enterprise domains.</w:t>
       </w:r>
     </w:p>
     <w:p>
@@ -14484,7 +14944,7 @@
           <w:sz w:val="21"/>
           <w:szCs w:val="21"/>
         </w:rPr>
-        <w:t xml:space="preserve">25 Year 1 initiatives — Technical Debt, Digital, Payer.</w:t>
+        <w:t xml:space="preserve">25 Year 1 initiatives — Technical Debt, Digital, Payer — delivering immediate, measurable value.</w:t>
       </w:r>
     </w:p>
     <w:p>
@@ -14507,7 +14967,7 @@
           <w:sz w:val="21"/>
           <w:szCs w:val="21"/>
         </w:rPr>
-        <w:t xml:space="preserve">15 Active / In-Flight as of programme launch.</w:t>
+        <w:t xml:space="preserve">15 Active / In-Flight as of programme launch — no ramp-up delay.</w:t>
       </w:r>
     </w:p>
     <w:p>
@@ -14530,7 +14990,63 @@
           <w:sz w:val="21"/>
           <w:szCs w:val="21"/>
         </w:rPr>
-        <w:t xml:space="preserve">All initiatives tracked live in CareOps360’s Transformation Roadmap dashboard.</w:t>
+        <w:t xml:space="preserve">9 milestones completed in foundation phase — demonstrating immediate traction.</w:t>
+      </w:r>
+    </w:p>
+    <w:p>
+      <w:pPr>
+        <w:pStyle w:val="ListParagraph"/>
+        <w:numPr>
+          <w:ilvl w:val="0"/>
+          <w:numId w:val="1"/>
+        </w:numPr>
+        <w:spacing w:after="60" w:before="20"/>
+      </w:pPr>
+      <w:r>
+        <w:rPr>
+          <w:rFonts w:ascii="Calibri" w:cs="Calibri" w:eastAsia="Calibri" w:hAnsi="Calibri"/>
+          <w:b w:val="false"/>
+          <w:bCs w:val="false"/>
+          <w:i w:val="false"/>
+          <w:iCs w:val="false"/>
+          <w:color w:val="525252"/>
+          <w:sz w:val="21"/>
+          <w:szCs w:val="21"/>
+        </w:rPr>
+        <w:t xml:space="preserve">All initiatives tracked live in CareOps360’s Transformation Roadmap dashboard with phase, status, owner, and risk updated in real time.</w:t>
+      </w:r>
+    </w:p>
+    <w:p>
+      <w:pPr>
+        <w:spacing w:after="80" w:before="0"/>
+      </w:pPr>
+      <w:r>
+        <w:rPr>
+          <w:rFonts w:ascii="Calibri" w:cs="Calibri" w:eastAsia="Calibri" w:hAnsi="Calibri"/>
+          <w:sz w:val="12"/>
+          <w:szCs w:val="12"/>
+        </w:rPr>
+        <w:t xml:space="preserve"/>
+      </w:r>
+    </w:p>
+    <w:p>
+      <w:pPr>
+        <w:shd w:fill="EBF2FF" w:val="clear"/>
+        <w:spacing w:after="120" w:before="120"/>
+        <w:ind w:left="360" w:right="360"/>
+      </w:pPr>
+      <w:r>
+        <w:rPr>
+          <w:rFonts w:ascii="Calibri" w:cs="Calibri" w:eastAsia="Calibri" w:hAnsi="Calibri"/>
+          <w:b/>
+          <w:bCs/>
+          <w:i w:val="false"/>
+          <w:iCs w:val="false"/>
+          <w:color w:val="001141"/>
+          <w:sz w:val="21"/>
+          <w:szCs w:val="21"/>
+        </w:rPr>
+        <w:t xml:space="preserve">CareOps360 makes every metric above visible in real time from Day 1. No manual reporting. No quarterly decks. Live data, always.</w:t>
       </w:r>
     </w:p>
     <w:p>
@@ -14678,7 +15194,7 @@
           <w:sz w:val="21"/>
           <w:szCs w:val="21"/>
         </w:rPr>
-        <w:t xml:space="preserve">IBM’s Integration Modernization programme transforms Horizon’s data exchange backbone from point-to-point batch processes to a cloud-native, event-driven, real-time integration architecture — enabling claims, eligibility, provider, and member data to flow continuously without overnight lag.</w:t>
+        <w:t xml:space="preserve">IBM’s Integration Modernization programme transforms Horizon’s data exchange backbone from point-to-point batch processes to a cloud-native, event-driven, real-time integration architecture — enabling claims, eligibility, provider, and member data to flow continuously across systems without overnight lag. When a member’s eligibility changes at 3 PM, every downstream system reflects it at 3:01 PM — not 6 AM the next day.</w:t>
       </w:r>
     </w:p>
     <w:p>
@@ -14701,7 +15217,7 @@
           <w:sz w:val="21"/>
           <w:szCs w:val="21"/>
         </w:rPr>
-        <w:t xml:space="preserve">MOM API-First Hub — Transform Messaging-Oriented Middleware to an API-first enterprise integration hub.</w:t>
+        <w:t xml:space="preserve">MOM API-First Hub (HLGN-1053) — Transform Horizon’s Messaging-Oriented Middleware from point-to-point topology to an API-first enterprise integration hub — enabling real-time, event-driven partner data exchange across claims, eligibility, and provider domains.</w:t>
       </w:r>
     </w:p>
     <w:p>
@@ -14724,7 +15240,7 @@
           <w:sz w:val="21"/>
           <w:szCs w:val="21"/>
         </w:rPr>
-        <w:t xml:space="preserve">Event Streaming Architecture — Replace batch ETL with Apache Kafka-based event streaming on AWS MSK.</w:t>
+        <w:t xml:space="preserve">Event Streaming Architecture — Replace batch ETL with Apache Kafka-based event streaming on AWS MSK — delivering sub-second data freshness across enrollment, claims, and provider systems.</w:t>
       </w:r>
     </w:p>
     <w:p>
@@ -14747,7 +15263,30 @@
           <w:sz w:val="21"/>
           <w:szCs w:val="21"/>
         </w:rPr>
-        <w:t xml:space="preserve">API Gateway Consolidation — Unified gateway replacing 70+ point-to-point integrations with governed, observable APIs.</w:t>
+        <w:t xml:space="preserve">API Gateway Consolidation — Unified API gateway via AWS API Gateway + IBM API Connect — replacing 70+ point-to-point integrations with governed, observable, versioned APIs.</w:t>
+      </w:r>
+    </w:p>
+    <w:p>
+      <w:pPr>
+        <w:pStyle w:val="ListParagraph"/>
+        <w:numPr>
+          <w:ilvl w:val="0"/>
+          <w:numId w:val="1"/>
+        </w:numPr>
+        <w:spacing w:after="60" w:before="20"/>
+      </w:pPr>
+      <w:r>
+        <w:rPr>
+          <w:rFonts w:ascii="Calibri" w:cs="Calibri" w:eastAsia="Calibri" w:hAnsi="Calibri"/>
+          <w:b w:val="false"/>
+          <w:bCs w:val="false"/>
+          <w:i w:val="false"/>
+          <w:iCs w:val="false"/>
+          <w:color w:val="525252"/>
+          <w:sz w:val="21"/>
+          <w:szCs w:val="21"/>
+        </w:rPr>
+        <w:t xml:space="preserve">ODM Cloud-Native (HLGN-1054) — Migrate IBM ODM Decision Center from on-premises to containerized cloud environment, enabling real-time business rule evaluation and business-user-configurable workflows.</w:t>
       </w:r>
     </w:p>
     <w:p>
@@ -14783,7 +15322,7 @@
           <w:sz w:val="21"/>
           <w:szCs w:val="21"/>
         </w:rPr>
-        <w:t xml:space="preserve">IBM will conduct a structured assessment of Horizon’s ~500+ application portfolio using Texture and IBM accelerators — identifying candidates for decommission, consolidation, cloud migration, or AI-augmented modernization.</w:t>
+        <w:t xml:space="preserve">IBM will conduct a structured assessment of Horizon’s ~1,000 application portfolio using Texture and IBM accelerators like ICCA — identifying candidates for decommission, consolidation, cloud migration, or AI-augmented modernization. Every application is catalogued, scored for business criticality, and assigned a modernization path. Redundant applications are consolidated. End-of-life platforms are replaced. The portfolio becomes leaner, faster, and cheaper to operate.</w:t>
       </w:r>
     </w:p>
     <w:p>
@@ -14819,7 +15358,7 @@
           <w:sz w:val="21"/>
           <w:szCs w:val="21"/>
         </w:rPr>
-        <w:t xml:space="preserve">Horizon’s mainframe hosts critical batch processing, eligibility logic, and financial settlement. IBM’s strategy executes phased migration preserving continuity:</w:t>
+        <w:t xml:space="preserve">Horizon’s mainframe hosts critical batch processing, eligibility logic, and financial settlement. IBM understands that modernizing this estate is not merely a technical programme — it is a strategic risk management exercise that must be executed with surgical precision. IBM proposes a phased, parallel-run migration approach:</w:t>
       </w:r>
     </w:p>
     <w:tbl>
@@ -15724,7 +16263,7 @@
                 <w:sz w:val="56"/>
                 <w:szCs w:val="56"/>
               </w:rPr>
-              <w:t xml:space="preserve">500+</w:t>
+              <w:t xml:space="preserve">~1,000</w:t>
             </w:r>
           </w:p>
           <w:p>
@@ -16047,6 +16586,42 @@
           <w:sz w:val="24"/>
           <w:szCs w:val="24"/>
         </w:rPr>
+        <w:t xml:space="preserve">Enterprise Transformation, Not Just IT</w:t>
+      </w:r>
+    </w:p>
+    <w:p>
+      <w:pPr>
+        <w:spacing w:after="100" w:before="0"/>
+      </w:pPr>
+      <w:r>
+        <w:rPr>
+          <w:rFonts w:ascii="Calibri" w:cs="Calibri" w:eastAsia="Calibri" w:hAnsi="Calibri"/>
+          <w:b w:val="false"/>
+          <w:bCs w:val="false"/>
+          <w:i w:val="false"/>
+          <w:iCs w:val="false"/>
+          <w:color w:val="525252"/>
+          <w:sz w:val="21"/>
+          <w:szCs w:val="21"/>
+        </w:rPr>
+        <w:t xml:space="preserve">IBM’s proposal delivers unified transformation across Operations, Development, and Quality Engineering — not siloed initiatives that optimize one tower while creating drag in another. IBM’s delivery philosophy — AI-Embedded Operations, Scalable Architecture, and Outcome-Based Engagement — ensures that every IBM investment compounds Horizon’s capability, not IBM’s margin.</w:t>
+      </w:r>
+    </w:p>
+    <w:p>
+      <w:pPr>
+        <w:spacing w:after="80" w:before="200"/>
+      </w:pPr>
+      <w:r>
+        <w:rPr>
+          <w:rFonts w:ascii="Calibri" w:cs="Calibri" w:eastAsia="Calibri" w:hAnsi="Calibri"/>
+          <w:b/>
+          <w:bCs/>
+          <w:i w:val="false"/>
+          <w:iCs w:val="false"/>
+          <w:color w:val="001141"/>
+          <w:sz w:val="24"/>
+          <w:szCs w:val="24"/>
+        </w:rPr>
         <w:t xml:space="preserve">What Differentiates IBM</w:t>
       </w:r>
     </w:p>
@@ -16083,7 +16658,7 @@
           <w:sz w:val="21"/>
           <w:szCs w:val="21"/>
         </w:rPr>
-        <w:t xml:space="preserve">Outcome-based engagement with IBM’s full capability depth behind every phase — IBM’s success is tied directly to Horizon’s outcomes. Not activity metrics. Business results.</w:t>
+        <w:t xml:space="preserve">Outcome-based engagement with IBM’s full capability depth behind every phase — IBM’s success is tied directly to Horizon’s outcomes. Targets missed trigger IBM remediation plans — not contract renegotiations or rate discussions. IBM carries the delivery risk.</w:t>
       </w:r>
     </w:p>
     <w:p>
@@ -16119,7 +16694,7 @@
           <w:sz w:val="21"/>
           <w:szCs w:val="21"/>
         </w:rPr>
-        <w:t xml:space="preserve">IBM’s Agentic AI, Generative AI, and AIOps capabilities are production-proven across healthcare and financial services — not proof-of-concept. Live at comparable payers today.</w:t>
+        <w:t xml:space="preserve">IBM’s Agentic AI, Generative AI, and AIOps capabilities are production-proven across healthcare and financial services — not proof-of-concept. Live at comparable payers today. Horizon benefits from Day 1, not after a 12-month buildout.</w:t>
       </w:r>
     </w:p>
     <w:p>
@@ -16155,7 +16730,7 @@
           <w:sz w:val="21"/>
           <w:szCs w:val="21"/>
         </w:rPr>
-        <w:t xml:space="preserve">Horizon realises accelerated value through IBM Consulting’s portfolio of 6,500+ assets and accelerators, strategic initiatives including IBM Build on Bedrock (BOB).</w:t>
+        <w:t xml:space="preserve">Horizon realises accelerated value through IBM Consulting’s portfolio of 6,500+ assets and accelerators, strategic initiatives including IBM Build on Bedrock (BOB). These are production-tested assets, not templates.</w:t>
       </w:r>
     </w:p>
     <w:p>
@@ -16191,12 +16766,48 @@
           <w:sz w:val="21"/>
           <w:szCs w:val="21"/>
         </w:rPr>
-        <w:t xml:space="preserve">IBM commits a structured quarterly innovation process — governed, prioritized, business-case-backed innovation at Horizon’s direction. Not a roadmap slide. A working programme.</w:t>
-      </w:r>
-    </w:p>
-    <w:p>
-      <w:pPr>
-        <w:spacing w:after="80" w:before="0"/>
+        <w:t xml:space="preserve">IBM commits a structured quarterly innovation process — governed, prioritized, business-case-backed innovation at Horizon’s direction. Not a roadmap slide. A working programme with dedicated leadership and budget.</w:t>
+      </w:r>
+    </w:p>
+    <w:p>
+      <w:pPr>
+        <w:spacing w:after="40" w:before="120"/>
+      </w:pPr>
+      <w:r>
+        <w:rPr>
+          <w:rFonts w:ascii="Calibri" w:cs="Calibri" w:eastAsia="Calibri" w:hAnsi="Calibri"/>
+          <w:b/>
+          <w:bCs/>
+          <w:i w:val="false"/>
+          <w:iCs w:val="false"/>
+          <w:color w:val="0F62FE"/>
+          <w:sz w:val="21"/>
+          <w:szCs w:val="21"/>
+        </w:rPr>
+        <w:t xml:space="preserve">Continuous Innovation Included</w:t>
+      </w:r>
+    </w:p>
+    <w:p>
+      <w:pPr>
+        <w:spacing w:after="100" w:before="0"/>
+      </w:pPr>
+      <w:r>
+        <w:rPr>
+          <w:rFonts w:ascii="Calibri" w:cs="Calibri" w:eastAsia="Calibri" w:hAnsi="Calibri"/>
+          <w:b w:val="false"/>
+          <w:bCs w:val="false"/>
+          <w:i w:val="false"/>
+          <w:iCs w:val="false"/>
+          <w:color w:val="525252"/>
+          <w:sz w:val="21"/>
+          <w:szCs w:val="21"/>
+        </w:rPr>
+        <w:t xml:space="preserve">Innovation sprints, AI tooling, and accelerators are built into the base delivery model. Transformation is not a separate future line item — it is embedded in every phase of the partnership.</w:t>
+      </w:r>
+    </w:p>
+    <w:p>
+      <w:pPr>
+        <w:spacing w:after="120" w:before="0"/>
       </w:pPr>
       <w:r>
         <w:rPr>
@@ -16459,7 +17070,7 @@
     </w:tbl>
     <w:p>
       <w:pPr>
-        <w:spacing w:after="120" w:before="0"/>
+        <w:spacing w:after="160" w:before="0"/>
       </w:pPr>
       <w:r>
         <w:rPr>
@@ -16572,7 +17183,7 @@
           <w:sz w:val="21"/>
           <w:szCs w:val="21"/>
         </w:rPr>
-        <w:t xml:space="preserve">Proven BCBS engagement track record.</w:t>
+        <w:t xml:space="preserve">Proven BCBS engagement track record — 9 of the top 10 US health payers served.</w:t>
       </w:r>
     </w:p>
     <w:p>
@@ -16596,6 +17207,29 @@
           <w:szCs w:val="21"/>
         </w:rPr>
         <w:t xml:space="preserve">Gartner Leader across 7 Data and AI Magic Quadrants (2025–2026).</w:t>
+      </w:r>
+    </w:p>
+    <w:p>
+      <w:pPr>
+        <w:pStyle w:val="ListParagraph"/>
+        <w:numPr>
+          <w:ilvl w:val="0"/>
+          <w:numId w:val="1"/>
+        </w:numPr>
+        <w:spacing w:after="60" w:before="20"/>
+      </w:pPr>
+      <w:r>
+        <w:rPr>
+          <w:rFonts w:ascii="Calibri" w:cs="Calibri" w:eastAsia="Calibri" w:hAnsi="Calibri"/>
+          <w:b w:val="false"/>
+          <w:bCs w:val="false"/>
+          <w:i w:val="false"/>
+          <w:iCs w:val="false"/>
+          <w:color w:val="525252"/>
+          <w:sz w:val="21"/>
+          <w:szCs w:val="21"/>
+        </w:rPr>
+        <w:t xml:space="preserve">CMS &amp; HIPAA compliance expertise — regulatory readiness from Day 1.</w:t>
       </w:r>
     </w:p>
     <w:p>

</xml_diff>

<commit_message>
Reduce the gap between columns for a tighter, more professional look
Adjust column gutter width and content sizing in the document generation script to minimize spacing between two-column layouts.

Replit-Commit-Author: Agent
Replit-Commit-Session-Id: 85ca0e57-022c-4e07-8505-5330d2441dfb
Replit-Commit-Checkpoint-Type: full_checkpoint
Replit-Commit-Event-Id: a3e02fd5-93dd-4a83-acb0-65a798ead54e
Replit-Commit-Screenshot-Url: https://storage.googleapis.com/screenshot-production-us-central1/c5ecfbc0-55f8-4296-b6fe-cd54067a2b61/85ca0e57-022c-4e07-8505-5330d2441dfb/tGntwW9
Replit-Helium-Checkpoint-Created: true
</commit_message>
<xml_diff>
--- a/attached_assets/IBM_Horizon_AMS_Executive_Summary_April2026.docx
+++ b/attached_assets/IBM_Horizon_AMS_Executive_Summary_April2026.docx
@@ -529,7 +529,7 @@
       <w:tr>
         <w:tc>
           <w:tcPr>
-            <w:tcW w:type="dxa" w:w="4399"/>
+            <w:tcW w:type="dxa" w:w="4493"/>
             <w:tcBorders>
               <w:top w:val="none" w:color="auto" w:sz="0"/>
               <w:left w:val="none" w:color="auto" w:sz="0"/>
@@ -638,7 +638,7 @@
         </w:tc>
         <w:tc>
           <w:tcPr>
-            <w:tcW w:type="dxa" w:w="562"/>
+            <w:tcW w:type="dxa" w:w="374"/>
             <w:tcBorders>
               <w:top w:val="none" w:color="auto" w:sz="0"/>
               <w:left w:val="none" w:color="auto" w:sz="0"/>
@@ -670,7 +670,7 @@
         </w:tc>
         <w:tc>
           <w:tcPr>
-            <w:tcW w:type="dxa" w:w="4399"/>
+            <w:tcW w:type="dxa" w:w="4493"/>
             <w:tcBorders>
               <w:top w:val="none" w:color="auto" w:sz="0"/>
               <w:left w:val="none" w:color="auto" w:sz="0"/>
@@ -1305,7 +1305,7 @@
       <w:tr>
         <w:tc>
           <w:tcPr>
-            <w:tcW w:type="dxa" w:w="4399"/>
+            <w:tcW w:type="dxa" w:w="4493"/>
             <w:tcBorders>
               <w:top w:val="none" w:color="auto" w:sz="0"/>
               <w:left w:val="none" w:color="auto" w:sz="0"/>
@@ -1493,7 +1493,7 @@
         </w:tc>
         <w:tc>
           <w:tcPr>
-            <w:tcW w:type="dxa" w:w="562"/>
+            <w:tcW w:type="dxa" w:w="374"/>
             <w:tcBorders>
               <w:top w:val="none" w:color="auto" w:sz="0"/>
               <w:left w:val="none" w:color="auto" w:sz="0"/>
@@ -1525,7 +1525,7 @@
         </w:tc>
         <w:tc>
           <w:tcPr>
-            <w:tcW w:type="dxa" w:w="4399"/>
+            <w:tcW w:type="dxa" w:w="4493"/>
             <w:tcBorders>
               <w:top w:val="none" w:color="auto" w:sz="0"/>
               <w:left w:val="none" w:color="auto" w:sz="0"/>
@@ -3129,7 +3129,7 @@
       <w:tr>
         <w:tc>
           <w:tcPr>
-            <w:tcW w:type="dxa" w:w="4399"/>
+            <w:tcW w:type="dxa" w:w="4493"/>
             <w:tcBorders>
               <w:top w:val="none" w:color="auto" w:sz="0"/>
               <w:left w:val="none" w:color="auto" w:sz="0"/>
@@ -3274,7 +3274,7 @@
         </w:tc>
         <w:tc>
           <w:tcPr>
-            <w:tcW w:type="dxa" w:w="562"/>
+            <w:tcW w:type="dxa" w:w="374"/>
             <w:tcBorders>
               <w:top w:val="none" w:color="auto" w:sz="0"/>
               <w:left w:val="none" w:color="auto" w:sz="0"/>
@@ -3306,7 +3306,7 @@
         </w:tc>
         <w:tc>
           <w:tcPr>
-            <w:tcW w:type="dxa" w:w="4399"/>
+            <w:tcW w:type="dxa" w:w="4493"/>
             <w:tcBorders>
               <w:top w:val="none" w:color="auto" w:sz="0"/>
               <w:left w:val="none" w:color="auto" w:sz="0"/>
@@ -4533,7 +4533,7 @@
       <w:tr>
         <w:tc>
           <w:tcPr>
-            <w:tcW w:type="dxa" w:w="4399"/>
+            <w:tcW w:type="dxa" w:w="4493"/>
             <w:tcBorders>
               <w:top w:val="none" w:color="auto" w:sz="0"/>
               <w:left w:val="none" w:color="auto" w:sz="0"/>
@@ -4678,7 +4678,7 @@
         </w:tc>
         <w:tc>
           <w:tcPr>
-            <w:tcW w:type="dxa" w:w="562"/>
+            <w:tcW w:type="dxa" w:w="374"/>
             <w:tcBorders>
               <w:top w:val="none" w:color="auto" w:sz="0"/>
               <w:left w:val="none" w:color="auto" w:sz="0"/>
@@ -4710,7 +4710,7 @@
         </w:tc>
         <w:tc>
           <w:tcPr>
-            <w:tcW w:type="dxa" w:w="4399"/>
+            <w:tcW w:type="dxa" w:w="4493"/>
             <w:tcBorders>
               <w:top w:val="none" w:color="auto" w:sz="0"/>
               <w:left w:val="none" w:color="auto" w:sz="0"/>
@@ -5835,7 +5835,7 @@
       <w:tr>
         <w:tc>
           <w:tcPr>
-            <w:tcW w:type="dxa" w:w="4399"/>
+            <w:tcW w:type="dxa" w:w="4493"/>
             <w:tcBorders>
               <w:top w:val="none" w:color="auto" w:sz="0"/>
               <w:left w:val="none" w:color="auto" w:sz="0"/>
@@ -6016,7 +6016,7 @@
         </w:tc>
         <w:tc>
           <w:tcPr>
-            <w:tcW w:type="dxa" w:w="562"/>
+            <w:tcW w:type="dxa" w:w="374"/>
             <w:tcBorders>
               <w:top w:val="none" w:color="auto" w:sz="0"/>
               <w:left w:val="none" w:color="auto" w:sz="0"/>
@@ -6048,7 +6048,7 @@
         </w:tc>
         <w:tc>
           <w:tcPr>
-            <w:tcW w:type="dxa" w:w="4399"/>
+            <w:tcW w:type="dxa" w:w="4493"/>
             <w:tcBorders>
               <w:top w:val="none" w:color="auto" w:sz="0"/>
               <w:left w:val="none" w:color="auto" w:sz="0"/>
@@ -6263,7 +6263,7 @@
           </w:p>
           <w:tbl>
             <w:tblPr>
-              <w:tblW w:type="dxa" w:w="4399"/>
+              <w:tblW w:type="dxa" w:w="4493"/>
               <w:tblBorders>
                 <w:top w:val="none" w:color="auto" w:sz="0"/>
                 <w:left w:val="none" w:color="auto" w:sz="0"/>
@@ -8422,7 +8422,7 @@
       <w:tr>
         <w:tc>
           <w:tcPr>
-            <w:tcW w:type="dxa" w:w="4399"/>
+            <w:tcW w:type="dxa" w:w="4493"/>
             <w:tcBorders>
               <w:top w:val="none" w:color="auto" w:sz="0"/>
               <w:left w:val="none" w:color="auto" w:sz="0"/>
@@ -8710,7 +8710,7 @@
         </w:tc>
         <w:tc>
           <w:tcPr>
-            <w:tcW w:type="dxa" w:w="562"/>
+            <w:tcW w:type="dxa" w:w="374"/>
             <w:tcBorders>
               <w:top w:val="none" w:color="auto" w:sz="0"/>
               <w:left w:val="none" w:color="auto" w:sz="0"/>
@@ -8742,7 +8742,7 @@
         </w:tc>
         <w:tc>
           <w:tcPr>
-            <w:tcW w:type="dxa" w:w="4399"/>
+            <w:tcW w:type="dxa" w:w="4493"/>
             <w:tcBorders>
               <w:top w:val="none" w:color="auto" w:sz="0"/>
               <w:left w:val="none" w:color="auto" w:sz="0"/>
@@ -8796,7 +8796,7 @@
           </w:p>
           <w:tbl>
             <w:tblPr>
-              <w:tblW w:type="dxa" w:w="4399"/>
+              <w:tblW w:type="dxa" w:w="4493"/>
               <w:tblBorders>
                 <w:top w:val="none" w:color="auto" w:sz="0"/>
                 <w:left w:val="none" w:color="auto" w:sz="0"/>
@@ -9225,7 +9225,7 @@
           </w:p>
           <w:tbl>
             <w:tblPr>
-              <w:tblW w:type="dxa" w:w="4399"/>
+              <w:tblW w:type="dxa" w:w="4493"/>
               <w:tblBorders>
                 <w:top w:val="none" w:color="auto" w:sz="0"/>
                 <w:left w:val="none" w:color="auto" w:sz="0"/>
@@ -9318,7 +9318,7 @@
               </w:tc>
               <w:tc>
                 <w:tcPr>
-                  <w:tcW w:type="dxa" w:w="936"/>
+                  <w:tcW w:type="dxa" w:w="1030"/>
                   <w:tcBorders>
                     <w:top w:val="single" w:color="0F62FE" w:sz="14"/>
                     <w:left w:val="single" w:color="E0E0E0" w:sz="4"/>
@@ -9431,7 +9431,7 @@
               </w:tc>
               <w:tc>
                 <w:tcPr>
-                  <w:tcW w:type="dxa" w:w="936"/>
+                  <w:tcW w:type="dxa" w:w="1030"/>
                   <w:tcBorders>
                     <w:top w:val="single" w:color="E0E0E0" w:sz="4"/>
                     <w:left w:val="single" w:color="E0E0E0" w:sz="4"/>
@@ -9545,7 +9545,7 @@
               </w:tc>
               <w:tc>
                 <w:tcPr>
-                  <w:tcW w:type="dxa" w:w="936"/>
+                  <w:tcW w:type="dxa" w:w="1030"/>
                   <w:tcBorders>
                     <w:top w:val="single" w:color="E0E0E0" w:sz="4"/>
                     <w:left w:val="single" w:color="E0E0E0" w:sz="4"/>
@@ -9659,7 +9659,7 @@
               </w:tc>
               <w:tc>
                 <w:tcPr>
-                  <w:tcW w:type="dxa" w:w="936"/>
+                  <w:tcW w:type="dxa" w:w="1030"/>
                   <w:tcBorders>
                     <w:top w:val="single" w:color="E0E0E0" w:sz="4"/>
                     <w:left w:val="single" w:color="E0E0E0" w:sz="4"/>
@@ -9773,7 +9773,7 @@
               </w:tc>
               <w:tc>
                 <w:tcPr>
-                  <w:tcW w:type="dxa" w:w="936"/>
+                  <w:tcW w:type="dxa" w:w="1030"/>
                   <w:tcBorders>
                     <w:top w:val="single" w:color="E0E0E0" w:sz="4"/>
                     <w:left w:val="single" w:color="E0E0E0" w:sz="4"/>
@@ -9887,7 +9887,7 @@
               </w:tc>
               <w:tc>
                 <w:tcPr>
-                  <w:tcW w:type="dxa" w:w="936"/>
+                  <w:tcW w:type="dxa" w:w="1030"/>
                   <w:tcBorders>
                     <w:top w:val="single" w:color="E0E0E0" w:sz="4"/>
                     <w:left w:val="single" w:color="E0E0E0" w:sz="4"/>
@@ -10062,7 +10062,7 @@
       <w:tr>
         <w:tc>
           <w:tcPr>
-            <w:tcW w:type="dxa" w:w="4399"/>
+            <w:tcW w:type="dxa" w:w="4493"/>
             <w:tcBorders>
               <w:top w:val="none" w:color="auto" w:sz="0"/>
               <w:left w:val="none" w:color="auto" w:sz="0"/>
@@ -10342,7 +10342,7 @@
         </w:tc>
         <w:tc>
           <w:tcPr>
-            <w:tcW w:type="dxa" w:w="562"/>
+            <w:tcW w:type="dxa" w:w="374"/>
             <w:tcBorders>
               <w:top w:val="none" w:color="auto" w:sz="0"/>
               <w:left w:val="none" w:color="auto" w:sz="0"/>
@@ -10374,7 +10374,7 @@
         </w:tc>
         <w:tc>
           <w:tcPr>
-            <w:tcW w:type="dxa" w:w="4399"/>
+            <w:tcW w:type="dxa" w:w="4493"/>
             <w:tcBorders>
               <w:top w:val="none" w:color="auto" w:sz="0"/>
               <w:left w:val="none" w:color="auto" w:sz="0"/>
@@ -10410,7 +10410,7 @@
           </w:p>
           <w:tbl>
             <w:tblPr>
-              <w:tblW w:type="dxa" w:w="4399"/>
+              <w:tblW w:type="dxa" w:w="4493"/>
               <w:tblBorders>
                 <w:top w:val="none" w:color="auto" w:sz="0"/>
                 <w:left w:val="none" w:color="auto" w:sz="0"/>
@@ -11067,7 +11067,7 @@
           </w:p>
           <w:tbl>
             <w:tblPr>
-              <w:tblW w:type="dxa" w:w="4399"/>
+              <w:tblW w:type="dxa" w:w="4493"/>
               <w:tblBorders>
                 <w:top w:val="none" w:color="auto" w:sz="0"/>
                 <w:left w:val="none" w:color="auto" w:sz="0"/>
@@ -12695,7 +12695,7 @@
       <w:tr>
         <w:tc>
           <w:tcPr>
-            <w:tcW w:type="dxa" w:w="4399"/>
+            <w:tcW w:type="dxa" w:w="4493"/>
             <w:tcBorders>
               <w:top w:val="none" w:color="auto" w:sz="0"/>
               <w:left w:val="none" w:color="auto" w:sz="0"/>
@@ -13335,7 +13335,7 @@
         </w:tc>
         <w:tc>
           <w:tcPr>
-            <w:tcW w:type="dxa" w:w="562"/>
+            <w:tcW w:type="dxa" w:w="374"/>
             <w:tcBorders>
               <w:top w:val="none" w:color="auto" w:sz="0"/>
               <w:left w:val="none" w:color="auto" w:sz="0"/>
@@ -13367,7 +13367,7 @@
         </w:tc>
         <w:tc>
           <w:tcPr>
-            <w:tcW w:type="dxa" w:w="4399"/>
+            <w:tcW w:type="dxa" w:w="4493"/>
             <w:tcBorders>
               <w:top w:val="none" w:color="auto" w:sz="0"/>
               <w:left w:val="none" w:color="auto" w:sz="0"/>
@@ -13549,7 +13549,7 @@
           </w:p>
           <w:tbl>
             <w:tblPr>
-              <w:tblW w:type="dxa" w:w="4399"/>
+              <w:tblW w:type="dxa" w:w="4493"/>
               <w:tblBorders>
                 <w:top w:val="none" w:color="auto" w:sz="0"/>
                 <w:left w:val="none" w:color="auto" w:sz="0"/>
@@ -14467,7 +14467,7 @@
       <w:tr>
         <w:tc>
           <w:tcPr>
-            <w:tcW w:type="dxa" w:w="4399"/>
+            <w:tcW w:type="dxa" w:w="4493"/>
             <w:tcBorders>
               <w:top w:val="none" w:color="auto" w:sz="0"/>
               <w:left w:val="none" w:color="auto" w:sz="0"/>
@@ -14684,7 +14684,7 @@
         </w:tc>
         <w:tc>
           <w:tcPr>
-            <w:tcW w:type="dxa" w:w="562"/>
+            <w:tcW w:type="dxa" w:w="374"/>
             <w:tcBorders>
               <w:top w:val="none" w:color="auto" w:sz="0"/>
               <w:left w:val="none" w:color="auto" w:sz="0"/>
@@ -14716,7 +14716,7 @@
         </w:tc>
         <w:tc>
           <w:tcPr>
-            <w:tcW w:type="dxa" w:w="4399"/>
+            <w:tcW w:type="dxa" w:w="4493"/>
             <w:tcBorders>
               <w:top w:val="none" w:color="auto" w:sz="0"/>
               <w:left w:val="none" w:color="auto" w:sz="0"/>

</xml_diff>